<commit_message>
Better documentation; organize functions
See especially Behavior analysis software v2 documentation.docx
</commit_message>
<xml_diff>
--- a/Zebrafish behavior identification methods.docx
+++ b/Zebrafish behavior identification methods.docx
@@ -59,10 +59,10 @@
         <w:t xml:space="preserve">Last modified </w:t>
       </w:r>
       <w:r>
-        <w:t xml:space="preserve">February </w:t>
-      </w:r>
-      <w:r>
-        <w:t>25</w:t>
+        <w:t xml:space="preserve">April </w:t>
+      </w:r>
+      <w:r>
+        <w:t>14</w:t>
       </w:r>
       <w:r>
         <w:t>, 202</w:t>
@@ -76,9 +76,11 @@
       <w:pPr>
         <w:pStyle w:val="Heading1"/>
       </w:pPr>
+      <w:proofErr w:type="gramStart"/>
       <w:r>
         <w:t>Inputs</w:t>
       </w:r>
+      <w:proofErr w:type="gramEnd"/>
     </w:p>
     <w:p>
       <w:r>
@@ -87,7 +89,15 @@
     </w:p>
     <w:p>
       <w:r>
-        <w:t xml:space="preserve">Tracking output from “ZebraZoom” </w:t>
+        <w:t>Tracking output from “</w:t>
+      </w:r>
+      <w:proofErr w:type="spellStart"/>
+      <w:r>
+        <w:t>ZebraZoom</w:t>
+      </w:r>
+      <w:proofErr w:type="spellEnd"/>
+      <w:r>
+        <w:t xml:space="preserve">” </w:t>
       </w:r>
       <w:r>
         <w:t>software. Ideally, it</w:t>
@@ -128,10 +138,26 @@
         <w:t>I</w:t>
       </w:r>
       <w:r>
-        <w:t xml:space="preserve">mage scale: </w:t>
-      </w:r>
-      <w:r>
-        <w:t xml:space="preserve"> mean ± std = 56.7 ± 0.6 um/px. Listed for each experiment in the fifth column of </w:t>
+        <w:t>mage scale</w:t>
+      </w:r>
+      <w:proofErr w:type="gramStart"/>
+      <w:r>
+        <w:t xml:space="preserve">: </w:t>
+      </w:r>
+      <w:r>
+        <w:t xml:space="preserve"> mean ±</w:t>
+      </w:r>
+      <w:proofErr w:type="gramEnd"/>
+      <w:r>
+        <w:t xml:space="preserve"> std = 56.7 ± 0.6 um/</w:t>
+      </w:r>
+      <w:proofErr w:type="spellStart"/>
+      <w:r>
+        <w:t>px</w:t>
+      </w:r>
+      <w:proofErr w:type="spellEnd"/>
+      <w:r>
+        <w:t xml:space="preserve">. Listed for each experiment in the fifth column of </w:t>
       </w:r>
       <w:r>
         <w:t>ArenaCenters_SocPref_3456.xslx</w:t>
@@ -156,11 +182,21 @@
       <w:r>
         <w:t xml:space="preserve"> </w:t>
       </w:r>
+      <w:proofErr w:type="spellStart"/>
       <w:r>
         <w:t>px</w:t>
       </w:r>
-      <w:r>
-        <w:t xml:space="preserve"> at 57 um/px)</w:t>
+      <w:proofErr w:type="spellEnd"/>
+      <w:r>
+        <w:t xml:space="preserve"> at 57 um/</w:t>
+      </w:r>
+      <w:proofErr w:type="spellStart"/>
+      <w:r>
+        <w:t>px</w:t>
+      </w:r>
+      <w:proofErr w:type="spellEnd"/>
+      <w:r>
+        <w:t>)</w:t>
       </w:r>
       <w:r>
         <w:t>.</w:t>
@@ -277,6 +313,7 @@
       </w:r>
     </w:p>
     <w:p>
+      <w:proofErr w:type="spellStart"/>
       <w:r>
         <w:rPr>
           <w:b/>
@@ -292,6 +329,7 @@
         </w:rPr>
         <w:t>HH</w:t>
       </w:r>
+      <w:proofErr w:type="spellEnd"/>
       <w:r>
         <w:rPr>
           <w:b/>
@@ -300,7 +338,11 @@
         <w:t xml:space="preserve">: </w:t>
       </w:r>
       <w:r>
-        <w:t>distance vector between the head positions of the two fish; magnitude d</w:t>
+        <w:t xml:space="preserve">distance vector between the head positions of the two fish; magnitude </w:t>
+      </w:r>
+      <w:proofErr w:type="spellStart"/>
+      <w:r>
+        <w:t>d</w:t>
       </w:r>
       <w:r>
         <w:rPr>
@@ -308,11 +350,13 @@
         </w:rPr>
         <w:t>HH</w:t>
       </w:r>
+      <w:proofErr w:type="spellEnd"/>
       <w:r>
         <w:t>.</w:t>
       </w:r>
     </w:p>
     <w:p>
+      <w:proofErr w:type="spellStart"/>
       <w:r>
         <w:rPr>
           <w:b/>
@@ -329,6 +373,7 @@
         </w:rPr>
         <w:t>C</w:t>
       </w:r>
+      <w:proofErr w:type="spellEnd"/>
       <w:r>
         <w:rPr>
           <w:b/>
@@ -341,6 +386,7 @@
       </w:r>
     </w:p>
     <w:p>
+      <w:proofErr w:type="spellStart"/>
       <w:r>
         <w:rPr>
           <w:rFonts w:ascii="Calibri" w:hAnsi="Calibri" w:cs="Calibri"/>
@@ -357,6 +403,7 @@
         </w:rPr>
         <w:t>i</w:t>
       </w:r>
+      <w:proofErr w:type="spellEnd"/>
       <w:r>
         <w:rPr>
           <w:b/>
@@ -365,13 +412,30 @@
         <w:t>:</w:t>
       </w:r>
       <w:r>
-        <w:t xml:space="preserve"> The heading angle of fish i (i = 1, 2)</w:t>
+        <w:t xml:space="preserve"> The heading angle of fish </w:t>
+      </w:r>
+      <w:proofErr w:type="spellStart"/>
+      <w:r>
+        <w:t>i</w:t>
+      </w:r>
+      <w:proofErr w:type="spellEnd"/>
+      <w:r>
+        <w:t xml:space="preserve"> (</w:t>
+      </w:r>
+      <w:proofErr w:type="spellStart"/>
+      <w:r>
+        <w:t>i</w:t>
+      </w:r>
+      <w:proofErr w:type="spellEnd"/>
+      <w:r>
+        <w:t xml:space="preserve"> = 1, 2)</w:t>
       </w:r>
       <w:r>
         <w:t>, i.e. the angle relative to the zero angle of the lab coordinate system.</w:t>
       </w:r>
     </w:p>
     <w:p>
+      <w:proofErr w:type="spellStart"/>
       <w:r>
         <w:rPr>
           <w:b/>
@@ -387,6 +451,7 @@
         </w:rPr>
         <w:t>i</w:t>
       </w:r>
+      <w:proofErr w:type="spellEnd"/>
       <w:r>
         <w:rPr>
           <w:b/>
@@ -398,7 +463,15 @@
         <w:t xml:space="preserve"> the </w:t>
       </w:r>
       <w:r>
-        <w:t>heading vector of fish i (I = 1, 2)</w:t>
+        <w:t xml:space="preserve">heading vector of fish </w:t>
+      </w:r>
+      <w:proofErr w:type="spellStart"/>
+      <w:r>
+        <w:t>i</w:t>
+      </w:r>
+      <w:proofErr w:type="spellEnd"/>
+      <w:r>
+        <w:t xml:space="preserve"> (I = 1, 2)</w:t>
       </w:r>
     </w:p>
     <w:p/>
@@ -413,7 +486,15 @@
     </w:p>
     <w:p>
       <w:r>
-        <w:t>The following are not identified as discrete events, but rather characterize properties of each individual fish trajectory</w:t>
+        <w:t xml:space="preserve">The following are not identified as discrete </w:t>
+      </w:r>
+      <w:proofErr w:type="gramStart"/>
+      <w:r>
+        <w:t>events, but</w:t>
+      </w:r>
+      <w:proofErr w:type="gramEnd"/>
+      <w:r>
+        <w:t xml:space="preserve"> rather characterize properties of each individual fish trajectory</w:t>
       </w:r>
       <w:r>
         <w:t>.</w:t>
@@ -467,6 +548,7 @@
       </w:r>
     </w:p>
     <w:p>
+      <w:proofErr w:type="spellStart"/>
       <w:r>
         <w:rPr>
           <w:rFonts w:ascii="Calibri" w:hAnsi="Calibri" w:cs="Calibri"/>
@@ -479,6 +561,7 @@
         </w:rPr>
         <w:t>_threshold</w:t>
       </w:r>
+      <w:proofErr w:type="spellEnd"/>
       <w:r>
         <w:t xml:space="preserve"> = </w:t>
       </w:r>
@@ -514,6 +597,7 @@
       <w:r>
         <w:t>“</w:t>
       </w:r>
+      <w:proofErr w:type="spellStart"/>
       <w:r>
         <w:rPr>
           <w:rFonts w:ascii="Courier New" w:hAnsi="Courier New" w:cs="Courier New"/>
@@ -535,6 +619,7 @@
         </w:rPr>
         <w:t>_mm</w:t>
       </w:r>
+      <w:proofErr w:type="spellEnd"/>
       <w:r>
         <w:t>”. No</w:t>
       </w:r>
@@ -553,6 +638,7 @@
       <w:r>
         <w:t xml:space="preserve"> (There is a separate “</w:t>
       </w:r>
+      <w:proofErr w:type="spellStart"/>
       <w:r>
         <w:rPr>
           <w:rFonts w:ascii="Courier New" w:hAnsi="Courier New" w:cs="Courier New"/>
@@ -560,6 +646,7 @@
         </w:rPr>
         <w:t>edge_rejection_threshold_mm</w:t>
       </w:r>
+      <w:proofErr w:type="spellEnd"/>
       <w:r>
         <w:t>” parameter for rejecting behavior counts.)</w:t>
       </w:r>
@@ -580,6 +667,7 @@
       </w:r>
     </w:p>
     <w:p>
+      <w:proofErr w:type="spellStart"/>
       <w:r>
         <w:rPr>
           <w:rFonts w:ascii="Courier New" w:hAnsi="Courier New" w:cs="Courier New"/>
@@ -601,6 +689,7 @@
         </w:rPr>
         <w:t>_mm</w:t>
       </w:r>
+      <w:proofErr w:type="spellEnd"/>
       <w:r>
         <w:t xml:space="preserve"> = 5 mm</w:t>
       </w:r>
@@ -695,9 +784,11 @@
       <w:r>
         <w:t>|</w:t>
       </w:r>
+      <w:proofErr w:type="gramStart"/>
       <w:r>
         <w:t>cos(</w:t>
       </w:r>
+      <w:proofErr w:type="gramEnd"/>
       <w:r>
         <w:rPr>
           <w:rFonts w:ascii="Calibri" w:hAnsi="Calibri" w:cs="Calibri"/>
@@ -722,6 +813,7 @@
         </w:rPr>
         <w:t>– Θ</w:t>
       </w:r>
+      <w:proofErr w:type="gramStart"/>
       <w:r>
         <w:rPr>
           <w:vertAlign w:val="subscript"/>
@@ -734,9 +826,11 @@
       <w:r>
         <w:t>|</w:t>
       </w:r>
+      <w:proofErr w:type="gramEnd"/>
       <w:r>
         <w:t xml:space="preserve"> &lt; </w:t>
       </w:r>
+      <w:proofErr w:type="spellStart"/>
       <w:r>
         <w:rPr>
           <w:rFonts w:asciiTheme="majorHAnsi" w:hAnsiTheme="majorHAnsi" w:cstheme="majorHAnsi"/>
@@ -757,8 +851,13 @@
         </w:rPr>
         <w:t>_perp</w:t>
       </w:r>
-      <w:r>
-        <w:t xml:space="preserve"> and d</w:t>
+      <w:proofErr w:type="spellEnd"/>
+      <w:r>
+        <w:t xml:space="preserve"> and </w:t>
+      </w:r>
+      <w:proofErr w:type="spellStart"/>
+      <w:r>
+        <w:t>d</w:t>
       </w:r>
       <w:r>
         <w:rPr>
@@ -766,21 +865,25 @@
         </w:rPr>
         <w:t>C</w:t>
       </w:r>
+      <w:proofErr w:type="spellEnd"/>
       <w:r>
         <w:t xml:space="preserve"> &lt;</w:t>
       </w:r>
       <w:r>
         <w:t xml:space="preserve"> </w:t>
       </w:r>
+      <w:proofErr w:type="spellStart"/>
       <w:r>
         <w:rPr>
           <w:rFonts w:asciiTheme="minorHAnsi" w:hAnsiTheme="minorHAnsi" w:cstheme="minorHAnsi"/>
         </w:rPr>
         <w:t>perp_maxDistance</w:t>
       </w:r>
+      <w:proofErr w:type="spellEnd"/>
       <w:r>
         <w:t xml:space="preserve"> for all frames in a window of length </w:t>
       </w:r>
+      <w:proofErr w:type="spellStart"/>
       <w:r>
         <w:rPr>
           <w:rFonts w:asciiTheme="minorHAnsi" w:hAnsiTheme="minorHAnsi" w:cstheme="minorHAnsi"/>
@@ -793,6 +896,7 @@
         </w:rPr>
         <w:t>_windowsize</w:t>
       </w:r>
+      <w:proofErr w:type="spellEnd"/>
       <w:r>
         <w:t>.</w:t>
       </w:r>
@@ -806,7 +910,31 @@
         <w:t>Subcategories:</w:t>
       </w:r>
       <w:r>
-        <w:t xml:space="preserve"> The configuration can be such that none, one, or both of the fish are facing the other</w:t>
+        <w:t xml:space="preserve"> The configuration can be such that </w:t>
+      </w:r>
+      <w:proofErr w:type="gramStart"/>
+      <w:r>
+        <w:t>none, one</w:t>
+      </w:r>
+      <w:proofErr w:type="gramEnd"/>
+      <w:r>
+        <w:t xml:space="preserve">, </w:t>
+      </w:r>
+      <w:proofErr w:type="gramStart"/>
+      <w:r>
+        <w:t>or</w:t>
+      </w:r>
+      <w:proofErr w:type="gramEnd"/>
+      <w:r>
+        <w:t xml:space="preserve"> </w:t>
+      </w:r>
+      <w:proofErr w:type="gramStart"/>
+      <w:r>
+        <w:t>both of the fish</w:t>
+      </w:r>
+      <w:proofErr w:type="gramEnd"/>
+      <w:r>
+        <w:t xml:space="preserve"> are facing the other</w:t>
       </w:r>
       <w:r>
         <w:t xml:space="preserve"> fish.</w:t>
@@ -854,6 +982,7 @@
       <w:r>
         <w:t xml:space="preserve">, </w:t>
       </w:r>
+      <w:proofErr w:type="spellStart"/>
       <w:r>
         <w:rPr>
           <w:b/>
@@ -869,6 +998,7 @@
         </w:rPr>
         <w:t>j</w:t>
       </w:r>
+      <w:proofErr w:type="spellEnd"/>
       <w:r>
         <w:t xml:space="preserve">, </w:t>
       </w:r>
@@ -881,6 +1011,8 @@
       <w:r>
         <w:t xml:space="preserve"> </w:t>
       </w:r>
+      <w:proofErr w:type="spellStart"/>
+      <w:proofErr w:type="gramStart"/>
       <w:r>
         <w:rPr>
           <w:b/>
@@ -913,6 +1045,8 @@
         </w:rPr>
         <w:t>,jk</w:t>
       </w:r>
+      <w:proofErr w:type="spellEnd"/>
+      <w:proofErr w:type="gramEnd"/>
       <w:r>
         <w:t>. W</w:t>
       </w:r>
@@ -954,6 +1088,7 @@
       <w:r>
         <w:t xml:space="preserve">) &gt; </w:t>
       </w:r>
+      <w:proofErr w:type="spellStart"/>
       <w:r>
         <w:rPr>
           <w:rFonts w:ascii="Calibri" w:hAnsi="Calibri" w:cs="Calibri"/>
@@ -973,6 +1108,7 @@
         </w:rPr>
         <w:t>seeing</w:t>
       </w:r>
+      <w:proofErr w:type="spellEnd"/>
       <w:r>
         <w:t xml:space="preserve"> </w:t>
       </w:r>
@@ -1036,6 +1172,7 @@
       </w:r>
     </w:p>
     <w:p>
+      <w:proofErr w:type="spellStart"/>
       <w:r>
         <w:rPr>
           <w:rFonts w:asciiTheme="minorHAnsi" w:hAnsiTheme="minorHAnsi" w:cstheme="minorHAnsi"/>
@@ -1048,6 +1185,7 @@
         </w:rPr>
         <w:t>_windowsize</w:t>
       </w:r>
+      <w:proofErr w:type="spellEnd"/>
       <w:r>
         <w:t xml:space="preserve"> </w:t>
       </w:r>
@@ -1064,10 +1202,19 @@
         <w:t>8</w:t>
       </w:r>
       <w:r>
-        <w:t>0 ms)</w:t>
-      </w:r>
-    </w:p>
-    <w:p>
+        <w:t xml:space="preserve">0 </w:t>
+      </w:r>
+      <w:proofErr w:type="spellStart"/>
+      <w:r>
+        <w:t>ms</w:t>
+      </w:r>
+      <w:proofErr w:type="spellEnd"/>
+      <w:r>
+        <w:t>)</w:t>
+      </w:r>
+    </w:p>
+    <w:p>
+      <w:proofErr w:type="spellStart"/>
       <w:r>
         <w:rPr>
           <w:rFonts w:asciiTheme="majorHAnsi" w:hAnsiTheme="majorHAnsi" w:cstheme="majorHAnsi"/>
@@ -1088,6 +1235,7 @@
         </w:rPr>
         <w:t>_perp</w:t>
       </w:r>
+      <w:proofErr w:type="spellEnd"/>
       <w:r>
         <w:t xml:space="preserve"> = 0.</w:t>
       </w:r>
@@ -1114,6 +1262,7 @@
       </w:r>
     </w:p>
     <w:p>
+      <w:proofErr w:type="spellStart"/>
       <w:r>
         <w:rPr>
           <w:rFonts w:asciiTheme="majorHAnsi" w:hAnsiTheme="majorHAnsi" w:cstheme="majorHAnsi"/>
@@ -1127,17 +1276,20 @@
         </w:rPr>
         <w:t>seeing</w:t>
       </w:r>
+      <w:proofErr w:type="spellEnd"/>
       <w:r>
         <w:t xml:space="preserve"> = 0.5 (corresponding to ± 60 degrees)</w:t>
       </w:r>
     </w:p>
     <w:p>
+      <w:proofErr w:type="spellStart"/>
       <w:r>
         <w:rPr>
           <w:rFonts w:asciiTheme="minorHAnsi" w:hAnsiTheme="minorHAnsi" w:cstheme="minorHAnsi"/>
         </w:rPr>
         <w:t>perp_maxDistance</w:t>
       </w:r>
+      <w:proofErr w:type="spellEnd"/>
       <w:r>
         <w:t xml:space="preserve"> = </w:t>
       </w:r>
@@ -1168,7 +1320,546 @@
         </w:rPr>
         <w:lastRenderedPageBreak/>
         <w:drawing>
-          <wp:inline distT="0" distB="0" distL="0" distR="0" wp14:anchorId="65F6A5E4" wp14:editId="2A5B9484">
+          <wp:inline distT="0" distB="0" distL="0" distR="0" wp14:anchorId="2DD9BA48" wp14:editId="14CC2F68">
+            <wp:extent cx="2286000" cy="2758290"/>
+            <wp:effectExtent l="0" t="0" r="0" b="4445"/>
+            <wp:docPr id="4" name="Picture 4"/>
+            <wp:cNvGraphicFramePr>
+              <a:graphicFrameLocks xmlns:a="http://schemas.openxmlformats.org/drawingml/2006/main" noChangeAspect="1"/>
+            </wp:cNvGraphicFramePr>
+            <a:graphic xmlns:a="http://schemas.openxmlformats.org/drawingml/2006/main">
+              <a:graphicData uri="http://schemas.openxmlformats.org/drawingml/2006/picture">
+                <pic:pic xmlns:pic="http://schemas.openxmlformats.org/drawingml/2006/picture">
+                  <pic:nvPicPr>
+                    <pic:cNvPr id="0" name="Picture 4"/>
+                    <pic:cNvPicPr>
+                      <a:picLocks noChangeAspect="1" noChangeArrowheads="1"/>
+                    </pic:cNvPicPr>
+                  </pic:nvPicPr>
+                  <pic:blipFill>
+                    <a:blip r:embed="rId6" cstate="print">
+                      <a:extLst>
+                        <a:ext uri="{28A0092B-C50C-407E-A947-70E740481C1C}">
+                          <a14:useLocalDpi xmlns:a14="http://schemas.microsoft.com/office/drawing/2010/main" val="0"/>
+                        </a:ext>
+                      </a:extLst>
+                    </a:blip>
+                    <a:srcRect/>
+                    <a:stretch>
+                      <a:fillRect/>
+                    </a:stretch>
+                  </pic:blipFill>
+                  <pic:spPr bwMode="auto">
+                    <a:xfrm>
+                      <a:off x="0" y="0"/>
+                      <a:ext cx="2286000" cy="2758290"/>
+                    </a:xfrm>
+                    <a:prstGeom prst="rect">
+                      <a:avLst/>
+                    </a:prstGeom>
+                    <a:noFill/>
+                    <a:ln>
+                      <a:noFill/>
+                    </a:ln>
+                  </pic:spPr>
+                </pic:pic>
+              </a:graphicData>
+            </a:graphic>
+          </wp:inline>
+        </w:drawing>
+      </w:r>
+    </w:p>
+    <w:p>
+      <w:pPr>
+        <w:pStyle w:val="Heading2"/>
+      </w:pPr>
+      <w:r>
+        <w:t>Contact</w:t>
+      </w:r>
+    </w:p>
+    <w:p>
+      <w:r>
+        <w:t xml:space="preserve">The two fish are very close to each other. This need only persist for a single frame. Specifically, the minimum distance between the two fish, considering any pair of the ten markers on each fish, is less than a threshold value, </w:t>
+      </w:r>
+      <w:proofErr w:type="spellStart"/>
+      <w:r>
+        <w:t>d</w:t>
+      </w:r>
+      <w:r>
+        <w:rPr>
+          <w:vertAlign w:val="subscript"/>
+        </w:rPr>
+        <w:t>threshold_contact</w:t>
+      </w:r>
+      <w:proofErr w:type="spellEnd"/>
+      <w:r>
+        <w:t xml:space="preserve">. </w:t>
+      </w:r>
+    </w:p>
+    <w:p>
+      <w:r>
+        <w:t>Subcategories</w:t>
+      </w:r>
+      <w:r>
+        <w:t xml:space="preserve"> of </w:t>
+      </w:r>
+      <w:proofErr w:type="spellStart"/>
+      <w:r>
+        <w:rPr>
+          <w:b/>
+          <w:bCs/>
+        </w:rPr>
+        <w:t>contact_any</w:t>
+      </w:r>
+      <w:proofErr w:type="spellEnd"/>
+      <w:r>
+        <w:rPr>
+          <w:b/>
+          <w:bCs/>
+        </w:rPr>
+        <w:t>:</w:t>
+      </w:r>
+      <w:r>
+        <w:t xml:space="preserve"> </w:t>
+      </w:r>
+    </w:p>
+    <w:p>
+      <w:pPr>
+        <w:pStyle w:val="ListParagraph"/>
+        <w:numPr>
+          <w:ilvl w:val="0"/>
+          <w:numId w:val="2"/>
+        </w:numPr>
+      </w:pPr>
+      <w:r>
+        <w:rPr>
+          <w:b/>
+          <w:bCs/>
+        </w:rPr>
+        <w:t>Head-body contact,</w:t>
+      </w:r>
+      <w:r>
+        <w:t xml:space="preserve"> defined such that the distance between the head of one fish and </w:t>
+      </w:r>
+      <w:r>
+        <w:t xml:space="preserve">any point on </w:t>
+      </w:r>
+      <w:r>
+        <w:t xml:space="preserve">the body of the other is less than </w:t>
+      </w:r>
+      <w:proofErr w:type="spellStart"/>
+      <w:r>
+        <w:rPr>
+          <w:rFonts w:ascii="Calibri" w:hAnsi="Calibri" w:cs="Calibri"/>
+        </w:rPr>
+        <w:t>contact_distance_threshold</w:t>
+      </w:r>
+      <w:proofErr w:type="spellEnd"/>
+      <w:r>
+        <w:t xml:space="preserve">. </w:t>
+      </w:r>
+      <w:r>
+        <w:t>F</w:t>
+      </w:r>
+      <w:r>
+        <w:t xml:space="preserve">or the subset of head-body contact cases in which only </w:t>
+      </w:r>
+      <w:r>
+        <w:rPr>
+          <w:i/>
+          <w:iCs/>
+        </w:rPr>
+        <w:t>one</w:t>
+      </w:r>
+      <w:r>
+        <w:t xml:space="preserve"> fish </w:t>
+      </w:r>
+      <w:r>
+        <w:t>has</w:t>
+      </w:r>
+      <w:r>
+        <w:t xml:space="preserve"> head-body distance below threshold, record whether it’s the larger or smaller fish.</w:t>
+      </w:r>
+    </w:p>
+    <w:p>
+      <w:pPr>
+        <w:pStyle w:val="ListParagraph"/>
+        <w:numPr>
+          <w:ilvl w:val="0"/>
+          <w:numId w:val="2"/>
+        </w:numPr>
+      </w:pPr>
+      <w:r>
+        <w:rPr>
+          <w:b/>
+          <w:bCs/>
+        </w:rPr>
+        <w:t>Head-</w:t>
+      </w:r>
+      <w:r>
+        <w:rPr>
+          <w:b/>
+          <w:bCs/>
+        </w:rPr>
+        <w:t>head</w:t>
+      </w:r>
+      <w:r>
+        <w:rPr>
+          <w:b/>
+          <w:bCs/>
+        </w:rPr>
+        <w:t xml:space="preserve"> contact,</w:t>
+      </w:r>
+      <w:r>
+        <w:t xml:space="preserve"> defined such that the distance between the head of one fish and any the head of the other is less than </w:t>
+      </w:r>
+      <w:proofErr w:type="spellStart"/>
+      <w:r>
+        <w:rPr>
+          <w:rFonts w:ascii="Calibri" w:hAnsi="Calibri" w:cs="Calibri"/>
+        </w:rPr>
+        <w:t>contact_distance_threshold</w:t>
+      </w:r>
+      <w:proofErr w:type="spellEnd"/>
+      <w:r>
+        <w:t>. Note that these frames will also be counted as head-body contact.</w:t>
+      </w:r>
+    </w:p>
+    <w:p>
+      <w:pPr>
+        <w:pStyle w:val="ListParagraph"/>
+        <w:numPr>
+          <w:ilvl w:val="0"/>
+          <w:numId w:val="2"/>
+        </w:numPr>
+      </w:pPr>
+      <w:proofErr w:type="gramStart"/>
+      <w:r>
+        <w:rPr>
+          <w:b/>
+          <w:bCs/>
+        </w:rPr>
+        <w:t>Tail-tail contact,</w:t>
+      </w:r>
+      <w:proofErr w:type="gramEnd"/>
+      <w:r>
+        <w:rPr>
+          <w:b/>
+          <w:bCs/>
+        </w:rPr>
+        <w:t xml:space="preserve"> </w:t>
+      </w:r>
+      <w:r>
+        <w:t xml:space="preserve">defined such that the distance between any point on the tail of one fish is less than </w:t>
+      </w:r>
+      <w:proofErr w:type="spellStart"/>
+      <w:r>
+        <w:rPr>
+          <w:rFonts w:ascii="Calibri" w:hAnsi="Calibri" w:cs="Calibri"/>
+        </w:rPr>
+        <w:t>contact_distance_threshold</w:t>
+      </w:r>
+      <w:proofErr w:type="spellEnd"/>
+      <w:r>
+        <w:t xml:space="preserve"> from some point on the tail of the other fish. “Tail” is defined as the last four body positions.</w:t>
+      </w:r>
+    </w:p>
+    <w:p>
+      <w:pPr>
+        <w:pStyle w:val="ListParagraph"/>
+        <w:numPr>
+          <w:ilvl w:val="0"/>
+          <w:numId w:val="2"/>
+        </w:numPr>
+      </w:pPr>
+      <w:r>
+        <w:rPr>
+          <w:b/>
+          <w:bCs/>
+        </w:rPr>
+        <w:t>Inferred contact.</w:t>
+      </w:r>
+      <w:r>
+        <w:t xml:space="preserve"> </w:t>
+      </w:r>
+      <w:proofErr w:type="gramStart"/>
+      <w:r>
+        <w:t>Close proximity</w:t>
+      </w:r>
+      <w:proofErr w:type="gramEnd"/>
+      <w:r>
+        <w:t xml:space="preserve"> can lead to tracking failures in which the tracking software does not resolve two fish. Infer the existence of contact events (</w:t>
+      </w:r>
+      <w:r>
+        <w:rPr>
+          <w:b/>
+          <w:bCs/>
+        </w:rPr>
+        <w:t>inferred contact</w:t>
+      </w:r>
+      <w:r>
+        <w:t>) by either of the following occurring: (</w:t>
+      </w:r>
+      <w:proofErr w:type="spellStart"/>
+      <w:r>
+        <w:t>i</w:t>
+      </w:r>
+      <w:proofErr w:type="spellEnd"/>
+      <w:r>
+        <w:t xml:space="preserve">) Tracking failures that are preceded by the inter-fish (head-head) distance being less than </w:t>
+      </w:r>
+      <w:proofErr w:type="spellStart"/>
+      <w:r>
+        <w:rPr>
+          <w:rFonts w:ascii="Calibri" w:hAnsi="Calibri" w:cs="Calibri"/>
+        </w:rPr>
+        <w:t>contact_inferred_distance_threshold</w:t>
+      </w:r>
+      <w:proofErr w:type="spellEnd"/>
+      <w:r>
+        <w:t xml:space="preserve"> </w:t>
+      </w:r>
+      <w:r>
+        <w:rPr>
+          <w:i/>
+          <w:iCs/>
+        </w:rPr>
+        <w:t>and</w:t>
+      </w:r>
+      <w:r>
+        <w:t xml:space="preserve"> the distance monotonically decreasing over </w:t>
+      </w:r>
+      <w:proofErr w:type="spellStart"/>
+      <w:r>
+        <w:rPr>
+          <w:rFonts w:ascii="Calibri" w:hAnsi="Calibri" w:cs="Calibri"/>
+        </w:rPr>
+        <w:t>contact_inferred_window</w:t>
+      </w:r>
+      <w:proofErr w:type="spellEnd"/>
+      <w:r>
+        <w:t xml:space="preserve"> frames</w:t>
+      </w:r>
+      <w:r>
+        <w:t>. The last good frame before bad tracking is considered an inferred contact frame.</w:t>
+      </w:r>
+      <w:r>
+        <w:t xml:space="preserve"> (ii) </w:t>
+      </w:r>
+      <w:r>
+        <w:t>B</w:t>
+      </w:r>
+      <w:r>
+        <w:t>ad tracking frames that are preceded and followed by contact events, if the total distance the fish have moved is less than</w:t>
+      </w:r>
+      <w:r>
+        <w:t xml:space="preserve"> </w:t>
+      </w:r>
+      <w:proofErr w:type="spellStart"/>
+      <w:r>
+        <w:rPr>
+          <w:rFonts w:ascii="Calibri" w:hAnsi="Calibri" w:cs="Calibri"/>
+        </w:rPr>
+        <w:t>Nfish</w:t>
+      </w:r>
+      <w:proofErr w:type="spellEnd"/>
+      <w:r>
+        <w:rPr>
+          <w:rFonts w:ascii="Calibri" w:hAnsi="Calibri" w:cs="Calibri"/>
+        </w:rPr>
+        <w:t xml:space="preserve"> x</w:t>
+      </w:r>
+      <w:r>
+        <w:rPr>
+          <w:rFonts w:ascii="Calibri" w:hAnsi="Calibri" w:cs="Calibri"/>
+        </w:rPr>
+        <w:t xml:space="preserve"> </w:t>
+      </w:r>
+      <w:proofErr w:type="spellStart"/>
+      <w:r>
+        <w:rPr>
+          <w:rFonts w:ascii="Calibri" w:hAnsi="Calibri" w:cs="Calibri"/>
+        </w:rPr>
+        <w:t>contact_distance_threshold</w:t>
+      </w:r>
+      <w:proofErr w:type="spellEnd"/>
+      <w:r>
+        <w:t>.</w:t>
+      </w:r>
+    </w:p>
+    <w:p>
+      <w:r>
+        <w:lastRenderedPageBreak/>
+        <w:t>The “</w:t>
+      </w:r>
+      <w:proofErr w:type="spellStart"/>
+      <w:r>
+        <w:t>contact_any</w:t>
+      </w:r>
+      <w:proofErr w:type="spellEnd"/>
+      <w:r>
+        <w:t>” category includes</w:t>
+      </w:r>
+      <w:r>
+        <w:t xml:space="preserve"> </w:t>
+      </w:r>
+      <w:r>
+        <w:t>contact</w:t>
+      </w:r>
+      <w:r>
+        <w:t xml:space="preserve"> (body-body</w:t>
+      </w:r>
+      <w:r>
+        <w:t xml:space="preserve">, </w:t>
+      </w:r>
+      <w:r>
+        <w:t>head-body</w:t>
+      </w:r>
+      <w:r>
+        <w:t>, tail-tail</w:t>
+      </w:r>
+      <w:r>
+        <w:t>)</w:t>
+      </w:r>
+      <w:r>
+        <w:t xml:space="preserve"> and “inferred” contacts.</w:t>
+      </w:r>
+      <w:r>
+        <w:t xml:space="preserve"> Because of inferred contacts, this list of frames can include bad tracking frames</w:t>
+      </w:r>
+      <w:r>
+        <w:t>, unlike other behaviors.</w:t>
+      </w:r>
+      <w:r>
+        <w:t xml:space="preserve"> </w:t>
+      </w:r>
+    </w:p>
+    <w:p>
+      <w:pPr>
+        <w:rPr>
+          <w:b/>
+          <w:bCs/>
+        </w:rPr>
+      </w:pPr>
+      <w:r>
+        <w:rPr>
+          <w:b/>
+          <w:bCs/>
+        </w:rPr>
+        <w:t>Parameters:</w:t>
+      </w:r>
+    </w:p>
+    <w:p>
+      <w:proofErr w:type="spellStart"/>
+      <w:r>
+        <w:rPr>
+          <w:rFonts w:ascii="Calibri" w:hAnsi="Calibri" w:cs="Calibri"/>
+        </w:rPr>
+        <w:t>contact</w:t>
+      </w:r>
+      <w:r>
+        <w:rPr>
+          <w:rFonts w:ascii="Calibri" w:hAnsi="Calibri" w:cs="Calibri"/>
+        </w:rPr>
+        <w:t>_distance_threshold</w:t>
+      </w:r>
+      <w:proofErr w:type="spellEnd"/>
+      <w:r>
+        <w:t xml:space="preserve"> = 1.3 mm (approx. 16 </w:t>
+      </w:r>
+      <w:proofErr w:type="spellStart"/>
+      <w:r>
+        <w:t>px</w:t>
+      </w:r>
+      <w:proofErr w:type="spellEnd"/>
+      <w:r>
+        <w:t xml:space="preserve"> at 80 µm/</w:t>
+      </w:r>
+      <w:proofErr w:type="spellStart"/>
+      <w:r>
+        <w:t>px</w:t>
+      </w:r>
+      <w:proofErr w:type="spellEnd"/>
+      <w:r>
+        <w:t>)</w:t>
+      </w:r>
+    </w:p>
+    <w:p>
+      <w:proofErr w:type="spellStart"/>
+      <w:r>
+        <w:rPr>
+          <w:rFonts w:ascii="Calibri" w:hAnsi="Calibri" w:cs="Calibri"/>
+        </w:rPr>
+        <w:t>contact</w:t>
+      </w:r>
+      <w:r>
+        <w:rPr>
+          <w:rFonts w:ascii="Calibri" w:hAnsi="Calibri" w:cs="Calibri"/>
+        </w:rPr>
+        <w:t>_</w:t>
+      </w:r>
+      <w:r>
+        <w:rPr>
+          <w:rFonts w:ascii="Calibri" w:hAnsi="Calibri" w:cs="Calibri"/>
+        </w:rPr>
+        <w:t>inferred_</w:t>
+      </w:r>
+      <w:r>
+        <w:rPr>
+          <w:rFonts w:ascii="Calibri" w:hAnsi="Calibri" w:cs="Calibri"/>
+        </w:rPr>
+        <w:t>distance_threshold</w:t>
+      </w:r>
+      <w:proofErr w:type="spellEnd"/>
+      <w:r>
+        <w:t xml:space="preserve"> = 2.5 mm (approx. 31 </w:t>
+      </w:r>
+      <w:proofErr w:type="spellStart"/>
+      <w:r>
+        <w:t>px</w:t>
+      </w:r>
+      <w:proofErr w:type="spellEnd"/>
+      <w:r>
+        <w:t xml:space="preserve"> at 80 µm/</w:t>
+      </w:r>
+      <w:proofErr w:type="spellStart"/>
+      <w:r>
+        <w:t>px</w:t>
+      </w:r>
+      <w:proofErr w:type="spellEnd"/>
+      <w:r>
+        <w:t>)</w:t>
+      </w:r>
+    </w:p>
+    <w:p>
+      <w:proofErr w:type="spellStart"/>
+      <w:r>
+        <w:rPr>
+          <w:rFonts w:ascii="Calibri" w:hAnsi="Calibri" w:cs="Calibri"/>
+        </w:rPr>
+        <w:t>contact_inferred_window</w:t>
+      </w:r>
+      <w:proofErr w:type="spellEnd"/>
+      <w:r>
+        <w:t xml:space="preserve"> = 2 frames (80 </w:t>
+      </w:r>
+      <w:proofErr w:type="spellStart"/>
+      <w:r>
+        <w:t>ms</w:t>
+      </w:r>
+      <w:proofErr w:type="spellEnd"/>
+      <w:r>
+        <w:t>)</w:t>
+      </w:r>
+    </w:p>
+    <w:p/>
+    <w:p>
+      <w:r>
+        <w:rPr>
+          <w:noProof/>
+        </w:rPr>
+        <w:drawing>
+          <wp:inline distT="0" distB="0" distL="0" distR="0" wp14:anchorId="280EA7E5" wp14:editId="554BBAC1">
             <wp:extent cx="1828800" cy="3510507"/>
             <wp:effectExtent l="0" t="0" r="0" b="0"/>
             <wp:docPr id="3" name="Picture 3"/>
@@ -1185,7 +1876,7 @@
                     </pic:cNvPicPr>
                   </pic:nvPicPr>
                   <pic:blipFill>
-                    <a:blip r:embed="rId6" cstate="print">
+                    <a:blip r:embed="rId7" cstate="print">
                       <a:extLst>
                         <a:ext uri="{28A0092B-C50C-407E-A947-70E740481C1C}">
                           <a14:useLocalDpi xmlns:a14="http://schemas.microsoft.com/office/drawing/2010/main" val="0"/>
@@ -1227,14 +1918,25 @@
     </w:p>
     <w:p>
       <w:r>
-        <w:t xml:space="preserve">The two fish are oriented roughly </w:t>
-      </w:r>
-      <w:r>
-        <w:t xml:space="preserve">parallel or </w:t>
-      </w:r>
-      <w:r>
-        <w:t xml:space="preserve">antiparallel with their tails in close proximity over some time interval. Specifically, for all frames in a window of length </w:t>
-      </w:r>
+        <w:t xml:space="preserve">The two fish are oriented roughly parallel or antiparallel with their tails in </w:t>
+      </w:r>
+      <w:proofErr w:type="gramStart"/>
+      <w:r>
+        <w:t>close proximity</w:t>
+      </w:r>
+      <w:proofErr w:type="gramEnd"/>
+      <w:r>
+        <w:t xml:space="preserve"> over some time </w:t>
+      </w:r>
+      <w:proofErr w:type="gramStart"/>
+      <w:r>
+        <w:t>interval</w:t>
+      </w:r>
+      <w:proofErr w:type="gramEnd"/>
+      <w:r>
+        <w:t xml:space="preserve">. Specifically, for all frames in a window of length </w:t>
+      </w:r>
+      <w:proofErr w:type="spellStart"/>
       <w:r>
         <w:rPr>
           <w:rFonts w:asciiTheme="majorHAnsi" w:hAnsiTheme="majorHAnsi" w:cstheme="majorHAnsi"/>
@@ -1248,38 +1950,20 @@
         </w:rPr>
         <w:t>frames</w:t>
       </w:r>
-      <w:r>
-        <w:t xml:space="preserve">, </w:t>
-      </w:r>
-      <w:r>
-        <w:t xml:space="preserve">at least two of the </w:t>
-      </w:r>
-      <w:r>
-        <w:t>four</w:t>
-      </w:r>
-      <w:r>
-        <w:t xml:space="preserve"> most posterior tail positions </w:t>
-      </w:r>
-      <w:r>
-        <w:t xml:space="preserve">are </w:t>
-      </w:r>
-      <w:r>
-        <w:t xml:space="preserve">within </w:t>
-      </w:r>
+      <w:proofErr w:type="spellEnd"/>
+      <w:r>
+        <w:t xml:space="preserve">, at least two of the four most posterior tail positions are within </w:t>
+      </w:r>
+      <w:proofErr w:type="spellStart"/>
       <w:r>
         <w:rPr>
           <w:rFonts w:asciiTheme="minorHAnsi" w:hAnsiTheme="minorHAnsi" w:cstheme="minorHAnsi"/>
         </w:rPr>
         <w:t>tailrub_maxTailDist</w:t>
       </w:r>
-      <w:r>
-        <w:t xml:space="preserve"> </w:t>
-      </w:r>
-      <w:r>
-        <w:t>of each other, the head-head distance</w:t>
-      </w:r>
-      <w:r>
-        <w:t xml:space="preserve"> </w:t>
+      <w:proofErr w:type="spellEnd"/>
+      <w:r>
+        <w:t xml:space="preserve"> of each other, the head-head distance </w:t>
       </w:r>
       <w:r>
         <w:rPr>
@@ -1291,15 +1975,22 @@
       <w:r>
         <w:t xml:space="preserve"> &lt; </w:t>
       </w:r>
+      <w:proofErr w:type="spellStart"/>
       <w:r>
         <w:rPr>
           <w:rFonts w:asciiTheme="minorHAnsi" w:hAnsiTheme="minorHAnsi" w:cstheme="minorHAnsi"/>
         </w:rPr>
         <w:t>tailrub_maxHeadDist</w:t>
       </w:r>
-      <w:r>
-        <w:t>, and cos(</w:t>
-      </w:r>
+      <w:proofErr w:type="spellEnd"/>
+      <w:r>
+        <w:t xml:space="preserve">, and </w:t>
+      </w:r>
+      <w:proofErr w:type="gramStart"/>
+      <w:r>
+        <w:t>cos(</w:t>
+      </w:r>
+      <w:proofErr w:type="gramEnd"/>
       <w:r>
         <w:rPr>
           <w:rFonts w:ascii="Calibri" w:hAnsi="Calibri" w:cs="Calibri"/>
@@ -1333,6 +2024,7 @@
       <w:r>
         <w:t xml:space="preserve">) &lt; </w:t>
       </w:r>
+      <w:proofErr w:type="spellStart"/>
       <w:r>
         <w:rPr>
           <w:rFonts w:ascii="Calibri" w:hAnsi="Calibri" w:cs="Calibri"/>
@@ -1352,9 +2044,15 @@
         </w:rPr>
         <w:t>AntiParallel</w:t>
       </w:r>
-      <w:r>
-        <w:t xml:space="preserve"> for antiparallel rubs and cos(</w:t>
-      </w:r>
+      <w:proofErr w:type="spellEnd"/>
+      <w:r>
+        <w:t xml:space="preserve"> for antiparallel rubs and </w:t>
+      </w:r>
+      <w:proofErr w:type="gramStart"/>
+      <w:r>
+        <w:t>cos(</w:t>
+      </w:r>
+      <w:proofErr w:type="gramEnd"/>
       <w:r>
         <w:rPr>
           <w:rFonts w:ascii="Calibri" w:hAnsi="Calibri" w:cs="Calibri"/>
@@ -1388,6 +2086,7 @@
       <w:r>
         <w:t>) &gt; |</w:t>
       </w:r>
+      <w:proofErr w:type="spellStart"/>
       <w:r>
         <w:rPr>
           <w:rFonts w:ascii="Calibri" w:hAnsi="Calibri" w:cs="Calibri"/>
@@ -1407,11 +2106,9 @@
         </w:rPr>
         <w:t>AntiParallel</w:t>
       </w:r>
-      <w:r>
-        <w:t>| for parallel tail rubs.</w:t>
-      </w:r>
-      <w:r>
-        <w:t xml:space="preserve"> </w:t>
+      <w:proofErr w:type="spellEnd"/>
+      <w:r>
+        <w:t xml:space="preserve">| for parallel tail rubs. </w:t>
       </w:r>
     </w:p>
     <w:p>
@@ -1430,6 +2127,7 @@
       </w:r>
     </w:p>
     <w:p>
+      <w:proofErr w:type="spellStart"/>
       <w:r>
         <w:rPr>
           <w:rFonts w:asciiTheme="majorHAnsi" w:hAnsiTheme="majorHAnsi" w:cstheme="majorHAnsi"/>
@@ -1443,6 +2141,7 @@
         </w:rPr>
         <w:t>frames</w:t>
       </w:r>
+      <w:proofErr w:type="spellEnd"/>
       <w:r>
         <w:rPr>
           <w:rFonts w:asciiTheme="majorHAnsi" w:hAnsiTheme="majorHAnsi" w:cstheme="majorHAnsi"/>
@@ -1450,22 +2149,19 @@
         <w:t xml:space="preserve"> </w:t>
       </w:r>
       <w:r>
-        <w:t xml:space="preserve">= </w:t>
-      </w:r>
-      <w:r>
-        <w:t>2</w:t>
-      </w:r>
-      <w:r>
-        <w:t xml:space="preserve"> frames (</w:t>
-      </w:r>
-      <w:r>
-        <w:t>8</w:t>
-      </w:r>
-      <w:r>
-        <w:t>0 ms)</w:t>
-      </w:r>
-    </w:p>
-    <w:p>
+        <w:t xml:space="preserve">= 2 frames (80 </w:t>
+      </w:r>
+      <w:proofErr w:type="spellStart"/>
+      <w:r>
+        <w:t>ms</w:t>
+      </w:r>
+      <w:proofErr w:type="spellEnd"/>
+      <w:r>
+        <w:t>)</w:t>
+      </w:r>
+    </w:p>
+    <w:p>
+      <w:proofErr w:type="spellStart"/>
       <w:r>
         <w:rPr>
           <w:rFonts w:asciiTheme="majorHAnsi" w:hAnsiTheme="majorHAnsi" w:cstheme="majorHAnsi"/>
@@ -1479,472 +2175,55 @@
         </w:rPr>
         <w:t>AntiParallel</w:t>
       </w:r>
-      <w:r>
-        <w:t xml:space="preserve"> </w:t>
-      </w:r>
-      <w:r>
-        <w:t>= -0.8 (corresponding to 180 ± 37 degrees)</w:t>
-      </w:r>
-    </w:p>
-    <w:p>
+      <w:proofErr w:type="spellEnd"/>
+      <w:r>
+        <w:t xml:space="preserve"> = -0.8 (corresponding to 180 ± 37 degrees)</w:t>
+      </w:r>
+    </w:p>
+    <w:p>
+      <w:proofErr w:type="spellStart"/>
       <w:r>
         <w:rPr>
           <w:rFonts w:asciiTheme="minorHAnsi" w:hAnsiTheme="minorHAnsi" w:cstheme="minorHAnsi"/>
         </w:rPr>
         <w:t>tailrub_maxTailDist</w:t>
       </w:r>
-      <w:r>
-        <w:t xml:space="preserve"> = 2.0 mm (approx. 35 px)</w:t>
-      </w:r>
-    </w:p>
-    <w:p>
+      <w:proofErr w:type="spellEnd"/>
+      <w:r>
+        <w:t xml:space="preserve"> = 2.0 mm (approx. 35 </w:t>
+      </w:r>
+      <w:proofErr w:type="spellStart"/>
+      <w:r>
+        <w:t>px</w:t>
+      </w:r>
+      <w:proofErr w:type="spellEnd"/>
+      <w:r>
+        <w:t>)</w:t>
+      </w:r>
+    </w:p>
+    <w:p>
+      <w:proofErr w:type="spellStart"/>
       <w:r>
         <w:rPr>
           <w:rFonts w:asciiTheme="minorHAnsi" w:hAnsiTheme="minorHAnsi" w:cstheme="minorHAnsi"/>
         </w:rPr>
+        <w:lastRenderedPageBreak/>
         <w:t>tailrub_maxHeadDist</w:t>
       </w:r>
-      <w:r>
-        <w:t xml:space="preserve"> = 12.5 mm (approx. 220 px)</w:t>
+      <w:proofErr w:type="spellEnd"/>
+      <w:r>
+        <w:t xml:space="preserve"> = 12.5 mm (approx. 220 </w:t>
+      </w:r>
+      <w:proofErr w:type="spellStart"/>
+      <w:r>
+        <w:t>px</w:t>
+      </w:r>
+      <w:proofErr w:type="spellEnd"/>
+      <w:r>
+        <w:t>)</w:t>
       </w:r>
     </w:p>
     <w:p/>
-    <w:p>
-      <w:r>
-        <w:rPr>
-          <w:noProof/>
-        </w:rPr>
-        <w:lastRenderedPageBreak/>
-        <w:drawing>
-          <wp:inline distT="0" distB="0" distL="0" distR="0" wp14:anchorId="2A08A36A" wp14:editId="024E7215">
-            <wp:extent cx="2286000" cy="2758290"/>
-            <wp:effectExtent l="0" t="0" r="0" b="4445"/>
-            <wp:docPr id="4" name="Picture 4"/>
-            <wp:cNvGraphicFramePr>
-              <a:graphicFrameLocks xmlns:a="http://schemas.openxmlformats.org/drawingml/2006/main" noChangeAspect="1"/>
-            </wp:cNvGraphicFramePr>
-            <a:graphic xmlns:a="http://schemas.openxmlformats.org/drawingml/2006/main">
-              <a:graphicData uri="http://schemas.openxmlformats.org/drawingml/2006/picture">
-                <pic:pic xmlns:pic="http://schemas.openxmlformats.org/drawingml/2006/picture">
-                  <pic:nvPicPr>
-                    <pic:cNvPr id="0" name="Picture 4"/>
-                    <pic:cNvPicPr>
-                      <a:picLocks noChangeAspect="1" noChangeArrowheads="1"/>
-                    </pic:cNvPicPr>
-                  </pic:nvPicPr>
-                  <pic:blipFill>
-                    <a:blip r:embed="rId7" cstate="print">
-                      <a:extLst>
-                        <a:ext uri="{28A0092B-C50C-407E-A947-70E740481C1C}">
-                          <a14:useLocalDpi xmlns:a14="http://schemas.microsoft.com/office/drawing/2010/main" val="0"/>
-                        </a:ext>
-                      </a:extLst>
-                    </a:blip>
-                    <a:srcRect/>
-                    <a:stretch>
-                      <a:fillRect/>
-                    </a:stretch>
-                  </pic:blipFill>
-                  <pic:spPr bwMode="auto">
-                    <a:xfrm>
-                      <a:off x="0" y="0"/>
-                      <a:ext cx="2286000" cy="2758290"/>
-                    </a:xfrm>
-                    <a:prstGeom prst="rect">
-                      <a:avLst/>
-                    </a:prstGeom>
-                    <a:noFill/>
-                    <a:ln>
-                      <a:noFill/>
-                    </a:ln>
-                  </pic:spPr>
-                </pic:pic>
-              </a:graphicData>
-            </a:graphic>
-          </wp:inline>
-        </w:drawing>
-      </w:r>
-    </w:p>
-    <w:p>
-      <w:pPr>
-        <w:pStyle w:val="Heading2"/>
-      </w:pPr>
-      <w:r>
-        <w:t>Contact</w:t>
-      </w:r>
-    </w:p>
-    <w:p>
-      <w:r>
-        <w:t>The two fish are very close to each other. This need only persist for a single frame. Specifically, the minimum distance between the two fish, considering any pair of the ten markers on each fish, is less than a threshold value, d</w:t>
-      </w:r>
-      <w:r>
-        <w:rPr>
-          <w:vertAlign w:val="subscript"/>
-        </w:rPr>
-        <w:t>threshold_contact</w:t>
-      </w:r>
-      <w:r>
-        <w:t xml:space="preserve">. </w:t>
-      </w:r>
-    </w:p>
-    <w:p>
-      <w:r>
-        <w:t>Subcategories</w:t>
-      </w:r>
-      <w:r>
-        <w:t xml:space="preserve"> of </w:t>
-      </w:r>
-      <w:r>
-        <w:rPr>
-          <w:b/>
-          <w:bCs/>
-        </w:rPr>
-        <w:t>contact_any</w:t>
-      </w:r>
-      <w:r>
-        <w:rPr>
-          <w:b/>
-          <w:bCs/>
-        </w:rPr>
-        <w:t>:</w:t>
-      </w:r>
-      <w:r>
-        <w:t xml:space="preserve"> </w:t>
-      </w:r>
-    </w:p>
-    <w:p>
-      <w:pPr>
-        <w:pStyle w:val="ListParagraph"/>
-        <w:numPr>
-          <w:ilvl w:val="0"/>
-          <w:numId w:val="2"/>
-        </w:numPr>
-      </w:pPr>
-      <w:r>
-        <w:rPr>
-          <w:b/>
-          <w:bCs/>
-        </w:rPr>
-        <w:t>Head-body contact,</w:t>
-      </w:r>
-      <w:r>
-        <w:t xml:space="preserve"> defined such that the distance between the head of one fish and </w:t>
-      </w:r>
-      <w:r>
-        <w:t xml:space="preserve">any point on </w:t>
-      </w:r>
-      <w:r>
-        <w:t xml:space="preserve">the body of the other is less than </w:t>
-      </w:r>
-      <w:r>
-        <w:rPr>
-          <w:rFonts w:ascii="Calibri" w:hAnsi="Calibri" w:cs="Calibri"/>
-        </w:rPr>
-        <w:t>contact_distance_threshold</w:t>
-      </w:r>
-      <w:r>
-        <w:t xml:space="preserve">. </w:t>
-      </w:r>
-      <w:r>
-        <w:t>F</w:t>
-      </w:r>
-      <w:r>
-        <w:t xml:space="preserve">or the subset of head-body contact cases in which only </w:t>
-      </w:r>
-      <w:r>
-        <w:rPr>
-          <w:i/>
-          <w:iCs/>
-        </w:rPr>
-        <w:t>one</w:t>
-      </w:r>
-      <w:r>
-        <w:t xml:space="preserve"> fish </w:t>
-      </w:r>
-      <w:r>
-        <w:t>has</w:t>
-      </w:r>
-      <w:r>
-        <w:t xml:space="preserve"> head-body distance below threshold, record whether it’s the larger or smaller fish.</w:t>
-      </w:r>
-    </w:p>
-    <w:p>
-      <w:pPr>
-        <w:pStyle w:val="ListParagraph"/>
-        <w:numPr>
-          <w:ilvl w:val="0"/>
-          <w:numId w:val="2"/>
-        </w:numPr>
-      </w:pPr>
-      <w:r>
-        <w:rPr>
-          <w:b/>
-          <w:bCs/>
-        </w:rPr>
-        <w:t>Head-</w:t>
-      </w:r>
-      <w:r>
-        <w:rPr>
-          <w:b/>
-          <w:bCs/>
-        </w:rPr>
-        <w:t>head</w:t>
-      </w:r>
-      <w:r>
-        <w:rPr>
-          <w:b/>
-          <w:bCs/>
-        </w:rPr>
-        <w:t xml:space="preserve"> contact,</w:t>
-      </w:r>
-      <w:r>
-        <w:t xml:space="preserve"> defined such that the distance between the head of one fish and any </w:t>
-      </w:r>
-      <w:r>
-        <w:t>the head</w:t>
-      </w:r>
-      <w:r>
-        <w:t xml:space="preserve"> of the other is less than </w:t>
-      </w:r>
-      <w:r>
-        <w:rPr>
-          <w:rFonts w:ascii="Calibri" w:hAnsi="Calibri" w:cs="Calibri"/>
-        </w:rPr>
-        <w:t>contact_distance_threshold</w:t>
-      </w:r>
-      <w:r>
-        <w:t xml:space="preserve">. </w:t>
-      </w:r>
-      <w:r>
-        <w:t>Note that these frames will also be counted as head-body contact.</w:t>
-      </w:r>
-    </w:p>
-    <w:p>
-      <w:pPr>
-        <w:pStyle w:val="ListParagraph"/>
-        <w:numPr>
-          <w:ilvl w:val="0"/>
-          <w:numId w:val="2"/>
-        </w:numPr>
-      </w:pPr>
-      <w:r>
-        <w:rPr>
-          <w:b/>
-          <w:bCs/>
-        </w:rPr>
-        <w:t xml:space="preserve">Tail-tail contact, </w:t>
-      </w:r>
-      <w:r>
-        <w:t xml:space="preserve">defined such that the distance between any point on the tail of one fish is less than </w:t>
-      </w:r>
-      <w:r>
-        <w:rPr>
-          <w:rFonts w:ascii="Calibri" w:hAnsi="Calibri" w:cs="Calibri"/>
-        </w:rPr>
-        <w:t>contact_distance_threshold</w:t>
-      </w:r>
-      <w:r>
-        <w:t xml:space="preserve"> from some point on the tail of the other fish. “Tail” is defined as the last four body positions.</w:t>
-      </w:r>
-    </w:p>
-    <w:p>
-      <w:pPr>
-        <w:pStyle w:val="ListParagraph"/>
-        <w:numPr>
-          <w:ilvl w:val="0"/>
-          <w:numId w:val="2"/>
-        </w:numPr>
-      </w:pPr>
-      <w:r>
-        <w:rPr>
-          <w:b/>
-          <w:bCs/>
-        </w:rPr>
-        <w:t>Inferred contact.</w:t>
-      </w:r>
-      <w:r>
-        <w:t xml:space="preserve"> Close proximity can lead to tracking failures in which the tracking software does not resolve two fish. Infer the existence of contact events (</w:t>
-      </w:r>
-      <w:r>
-        <w:rPr>
-          <w:b/>
-          <w:bCs/>
-        </w:rPr>
-        <w:t>inferred contact</w:t>
-      </w:r>
-      <w:r>
-        <w:t xml:space="preserve">) by either of the following occurring: (i) Tracking failures that are preceded by the inter-fish (head-head) distance being less than </w:t>
-      </w:r>
-      <w:r>
-        <w:rPr>
-          <w:rFonts w:ascii="Calibri" w:hAnsi="Calibri" w:cs="Calibri"/>
-        </w:rPr>
-        <w:t>contact_inferred_distance_threshold</w:t>
-      </w:r>
-      <w:r>
-        <w:t xml:space="preserve"> </w:t>
-      </w:r>
-      <w:r>
-        <w:rPr>
-          <w:i/>
-          <w:iCs/>
-        </w:rPr>
-        <w:t>and</w:t>
-      </w:r>
-      <w:r>
-        <w:t xml:space="preserve"> the distance monotonically decreasing over </w:t>
-      </w:r>
-      <w:r>
-        <w:rPr>
-          <w:rFonts w:ascii="Calibri" w:hAnsi="Calibri" w:cs="Calibri"/>
-        </w:rPr>
-        <w:t>contact_inferred_window</w:t>
-      </w:r>
-      <w:r>
-        <w:t xml:space="preserve"> frames</w:t>
-      </w:r>
-      <w:r>
-        <w:t>. The last good frame before bad tracking is considered an inferred contact frame.</w:t>
-      </w:r>
-      <w:r>
-        <w:t xml:space="preserve"> (ii) </w:t>
-      </w:r>
-      <w:r>
-        <w:t>B</w:t>
-      </w:r>
-      <w:r>
-        <w:t>ad tracking frames that are preceded and followed by contact events, if the total distance the fish have moved is less than</w:t>
-      </w:r>
-      <w:r>
-        <w:t xml:space="preserve"> </w:t>
-      </w:r>
-      <w:r>
-        <w:rPr>
-          <w:rFonts w:ascii="Calibri" w:hAnsi="Calibri" w:cs="Calibri"/>
-        </w:rPr>
-        <w:t>Nfish x</w:t>
-      </w:r>
-      <w:r>
-        <w:rPr>
-          <w:rFonts w:ascii="Calibri" w:hAnsi="Calibri" w:cs="Calibri"/>
-        </w:rPr>
-        <w:t xml:space="preserve"> contact_distance_threshold</w:t>
-      </w:r>
-      <w:r>
-        <w:t>.</w:t>
-      </w:r>
-    </w:p>
-    <w:p>
-      <w:r>
-        <w:lastRenderedPageBreak/>
-        <w:t>The “contact_any” category includes</w:t>
-      </w:r>
-      <w:r>
-        <w:t xml:space="preserve"> </w:t>
-      </w:r>
-      <w:r>
-        <w:t>contact</w:t>
-      </w:r>
-      <w:r>
-        <w:t xml:space="preserve"> (body-body</w:t>
-      </w:r>
-      <w:r>
-        <w:t xml:space="preserve">, </w:t>
-      </w:r>
-      <w:r>
-        <w:t>head-body</w:t>
-      </w:r>
-      <w:r>
-        <w:t>, tail-tail</w:t>
-      </w:r>
-      <w:r>
-        <w:t>)</w:t>
-      </w:r>
-      <w:r>
-        <w:t xml:space="preserve"> and “inferred” contacts.</w:t>
-      </w:r>
-      <w:r>
-        <w:t xml:space="preserve"> Because of inferred contacts, this list of frames can include bad tracking frames</w:t>
-      </w:r>
-      <w:r>
-        <w:t>, unlike other behaviors.</w:t>
-      </w:r>
-      <w:r>
-        <w:t xml:space="preserve"> </w:t>
-      </w:r>
-    </w:p>
-    <w:p>
-      <w:pPr>
-        <w:rPr>
-          <w:b/>
-          <w:bCs/>
-        </w:rPr>
-      </w:pPr>
-      <w:r>
-        <w:rPr>
-          <w:b/>
-          <w:bCs/>
-        </w:rPr>
-        <w:t>Parameters:</w:t>
-      </w:r>
-    </w:p>
-    <w:p>
-      <w:r>
-        <w:rPr>
-          <w:rFonts w:ascii="Calibri" w:hAnsi="Calibri" w:cs="Calibri"/>
-        </w:rPr>
-        <w:t>contact</w:t>
-      </w:r>
-      <w:r>
-        <w:rPr>
-          <w:rFonts w:ascii="Calibri" w:hAnsi="Calibri" w:cs="Calibri"/>
-        </w:rPr>
-        <w:t>_distance_threshold</w:t>
-      </w:r>
-      <w:r>
-        <w:t xml:space="preserve"> = 1.3 mm (approx. 16 px at 80 µm/px)</w:t>
-      </w:r>
-    </w:p>
-    <w:p>
-      <w:r>
-        <w:rPr>
-          <w:rFonts w:ascii="Calibri" w:hAnsi="Calibri" w:cs="Calibri"/>
-        </w:rPr>
-        <w:t>contact</w:t>
-      </w:r>
-      <w:r>
-        <w:rPr>
-          <w:rFonts w:ascii="Calibri" w:hAnsi="Calibri" w:cs="Calibri"/>
-        </w:rPr>
-        <w:t>_</w:t>
-      </w:r>
-      <w:r>
-        <w:rPr>
-          <w:rFonts w:ascii="Calibri" w:hAnsi="Calibri" w:cs="Calibri"/>
-        </w:rPr>
-        <w:t>inferred_</w:t>
-      </w:r>
-      <w:r>
-        <w:rPr>
-          <w:rFonts w:ascii="Calibri" w:hAnsi="Calibri" w:cs="Calibri"/>
-        </w:rPr>
-        <w:t>distance_threshold</w:t>
-      </w:r>
-      <w:r>
-        <w:t xml:space="preserve"> = 2.5 mm (approx. 31 px at 80 µm/px)</w:t>
-      </w:r>
-    </w:p>
-    <w:p>
-      <w:r>
-        <w:rPr>
-          <w:rFonts w:ascii="Calibri" w:hAnsi="Calibri" w:cs="Calibri"/>
-        </w:rPr>
-        <w:t>contact_inferred_window</w:t>
-      </w:r>
-      <w:r>
-        <w:t xml:space="preserve"> = 2 frames (80 ms)</w:t>
-      </w:r>
-    </w:p>
     <w:p/>
     <w:p>
       <w:r>
@@ -2046,6 +2325,7 @@
       <w:r>
         <w:t xml:space="preserve">) &gt; </w:t>
       </w:r>
+      <w:proofErr w:type="spellStart"/>
       <w:r>
         <w:rPr>
           <w:rFonts w:ascii="Calibri" w:hAnsi="Calibri" w:cs="Calibri"/>
@@ -2060,6 +2340,7 @@
         </w:rPr>
         <w:t>approach</w:t>
       </w:r>
+      <w:proofErr w:type="spellEnd"/>
       <w:r>
         <w:t>)).</w:t>
       </w:r>
@@ -2081,6 +2362,7 @@
       </w:r>
     </w:p>
     <w:p>
+      <w:proofErr w:type="spellStart"/>
       <w:r>
         <w:rPr>
           <w:rFonts w:ascii="Calibri" w:hAnsi="Calibri" w:cs="Calibri"/>
@@ -2093,17 +2375,28 @@
         </w:rPr>
         <w:t>_threshold</w:t>
       </w:r>
-      <w:r>
-        <w:t xml:space="preserve"> = 20 mm/s (approx. 15 px/frame)</w:t>
-      </w:r>
-    </w:p>
-    <w:p>
+      <w:proofErr w:type="spellEnd"/>
+      <w:r>
+        <w:t xml:space="preserve"> = 20 mm/s (approx. 15 </w:t>
+      </w:r>
+      <w:proofErr w:type="spellStart"/>
+      <w:r>
+        <w:t>px</w:t>
+      </w:r>
+      <w:proofErr w:type="spellEnd"/>
+      <w:r>
+        <w:t>/frame)</w:t>
+      </w:r>
+    </w:p>
+    <w:p>
+      <w:proofErr w:type="spellStart"/>
       <w:r>
         <w:rPr>
           <w:rFonts w:ascii="Calibri" w:hAnsi="Calibri" w:cs="Calibri"/>
         </w:rPr>
         <w:t>min_frame_duration</w:t>
       </w:r>
+      <w:proofErr w:type="spellEnd"/>
       <w:r>
         <w:rPr>
           <w:rFonts w:ascii="Calibri" w:hAnsi="Calibri" w:cs="Calibri"/>
@@ -2115,6 +2408,7 @@
       </w:r>
     </w:p>
     <w:p>
+      <w:proofErr w:type="spellStart"/>
       <w:r>
         <w:rPr>
           <w:rFonts w:ascii="Calibri" w:hAnsi="Calibri" w:cs="Calibri"/>
@@ -2129,6 +2423,7 @@
         </w:rPr>
         <w:t>approach</w:t>
       </w:r>
+      <w:proofErr w:type="spellEnd"/>
       <w:r>
         <w:rPr>
           <w:rFonts w:asciiTheme="majorHAnsi" w:hAnsiTheme="majorHAnsi" w:cstheme="majorHAnsi"/>
@@ -2174,6 +2469,7 @@
       <w:r>
         <w:t xml:space="preserve">) &lt; </w:t>
       </w:r>
+      <w:proofErr w:type="spellStart"/>
       <w:r>
         <w:rPr>
           <w:rFonts w:ascii="Calibri" w:hAnsi="Calibri" w:cs="Calibri"/>
@@ -2188,6 +2484,7 @@
         </w:rPr>
         <w:t>approach</w:t>
       </w:r>
+      <w:proofErr w:type="spellEnd"/>
       <w:r>
         <w:t>). Not that the angle criterion doesn’t require moving directly away (which would be cos(</w:t>
       </w:r>
@@ -2200,6 +2497,7 @@
       <w:r>
         <w:t xml:space="preserve">) &lt; -1 × </w:t>
       </w:r>
+      <w:proofErr w:type="spellStart"/>
       <w:r>
         <w:rPr>
           <w:rFonts w:ascii="Calibri" w:hAnsi="Calibri" w:cs="Calibri"/>
@@ -2214,6 +2512,7 @@
         </w:rPr>
         <w:t>approach</w:t>
       </w:r>
+      <w:proofErr w:type="spellEnd"/>
       <w:r>
         <w:t>); often fleeing fish take a perpendicular path.</w:t>
       </w:r>
@@ -2234,6 +2533,7 @@
       </w:r>
     </w:p>
     <w:p>
+      <w:proofErr w:type="spellStart"/>
       <w:r>
         <w:rPr>
           <w:rFonts w:ascii="Calibri" w:hAnsi="Calibri" w:cs="Calibri"/>
@@ -2246,18 +2546,28 @@
         </w:rPr>
         <w:t>_threshold</w:t>
       </w:r>
-      <w:r>
-        <w:t xml:space="preserve"> = 20 mm/s (approx. 15 px/frame)</w:t>
-      </w:r>
-    </w:p>
-    <w:p>
-      <w:r>
-        <w:rPr>
-          <w:rFonts w:ascii="Calibri" w:hAnsi="Calibri" w:cs="Calibri"/>
-        </w:rPr>
-        <w:lastRenderedPageBreak/>
+      <w:proofErr w:type="spellEnd"/>
+      <w:r>
+        <w:t xml:space="preserve"> = 20 mm/s (approx. 15 </w:t>
+      </w:r>
+      <w:proofErr w:type="spellStart"/>
+      <w:r>
+        <w:t>px</w:t>
+      </w:r>
+      <w:proofErr w:type="spellEnd"/>
+      <w:r>
+        <w:t>/frame)</w:t>
+      </w:r>
+    </w:p>
+    <w:p>
+      <w:proofErr w:type="spellStart"/>
+      <w:r>
+        <w:rPr>
+          <w:rFonts w:ascii="Calibri" w:hAnsi="Calibri" w:cs="Calibri"/>
+        </w:rPr>
         <w:t>min_frame_duration</w:t>
       </w:r>
+      <w:proofErr w:type="spellEnd"/>
       <w:r>
         <w:rPr>
           <w:rFonts w:ascii="Calibri" w:hAnsi="Calibri" w:cs="Calibri"/>
@@ -2269,6 +2579,7 @@
       </w:r>
     </w:p>
     <w:p>
+      <w:proofErr w:type="spellStart"/>
       <w:r>
         <w:rPr>
           <w:rFonts w:ascii="Calibri" w:hAnsi="Calibri" w:cs="Calibri"/>
@@ -2283,6 +2594,7 @@
         </w:rPr>
         <w:t>approach</w:t>
       </w:r>
+      <w:proofErr w:type="spellEnd"/>
       <w:r>
         <w:t xml:space="preserve"> = 0.5 (60 degrees)</w:t>
       </w:r>
@@ -2293,12 +2605,21 @@
         <w:pStyle w:val="Heading2"/>
       </w:pPr>
       <w:r>
+        <w:lastRenderedPageBreak/>
         <w:t>Proximity</w:t>
       </w:r>
     </w:p>
     <w:p>
       <w:r>
-        <w:t xml:space="preserve">The closest distance between two fish is less than some threshold distance. </w:t>
+        <w:t xml:space="preserve">The closest distance between two fish is less than </w:t>
+      </w:r>
+      <w:proofErr w:type="gramStart"/>
+      <w:r>
+        <w:t>some</w:t>
+      </w:r>
+      <w:proofErr w:type="gramEnd"/>
+      <w:r>
+        <w:t xml:space="preserve"> threshold distance. </w:t>
       </w:r>
     </w:p>
     <w:p>
@@ -2317,6 +2638,7 @@
       </w:r>
     </w:p>
     <w:p>
+      <w:proofErr w:type="spellStart"/>
       <w:r>
         <w:rPr>
           <w:rFonts w:ascii="Calibri" w:hAnsi="Calibri" w:cs="Calibri"/>
@@ -2335,6 +2657,7 @@
         </w:rPr>
         <w:t>_mm</w:t>
       </w:r>
+      <w:proofErr w:type="spellEnd"/>
       <w:r>
         <w:t xml:space="preserve"> = 7 mm (approx. 1 body length)</w:t>
       </w:r>
@@ -2407,51 +2730,50 @@
         <w:t>Two fish maintain proximity</w:t>
       </w:r>
       <w:r>
-        <w:t xml:space="preserve"> (</w:t>
-      </w:r>
-      <w:bookmarkStart w:id="3" w:name="_Hlk217575321"/>
-      <w:r>
-        <w:t>closest distance</w:t>
-      </w:r>
-      <w:bookmarkEnd w:id="3"/>
+        <w:t xml:space="preserve">, </w:t>
+      </w:r>
+      <w:r>
+        <w:t>with separation in some range (</w:t>
+      </w:r>
+      <w:proofErr w:type="spellStart"/>
+      <w:r>
+        <w:rPr>
+          <w:rFonts w:ascii="Calibri" w:hAnsi="Calibri" w:cs="Calibri"/>
+        </w:rPr>
+        <w:t>proximity_threshold_mm_min</w:t>
+      </w:r>
+      <w:proofErr w:type="spellEnd"/>
+      <w:r>
+        <w:t xml:space="preserve"> </w:t>
+      </w:r>
+      <w:r>
+        <w:t xml:space="preserve">to </w:t>
+      </w:r>
+      <w:proofErr w:type="spellStart"/>
+      <w:r>
+        <w:rPr>
+          <w:rFonts w:ascii="Calibri" w:hAnsi="Calibri" w:cs="Calibri"/>
+        </w:rPr>
+        <w:t>proximity_threshold_mm_</w:t>
+      </w:r>
+      <w:r>
+        <w:rPr>
+          <w:rFonts w:ascii="Calibri" w:hAnsi="Calibri" w:cs="Calibri"/>
+        </w:rPr>
+        <w:t>max</w:t>
+      </w:r>
+      <w:proofErr w:type="spellEnd"/>
       <w:r>
         <w:t>)</w:t>
       </w:r>
       <w:r>
-        <w:t xml:space="preserve">, </w:t>
-      </w:r>
-      <w:r>
-        <w:t>with separation in some range (</w:t>
-      </w:r>
-      <w:r>
-        <w:rPr>
-          <w:rFonts w:ascii="Calibri" w:hAnsi="Calibri" w:cs="Calibri"/>
-        </w:rPr>
-        <w:t>proximity_threshold_mm_min</w:t>
-      </w:r>
-      <w:r>
-        <w:t xml:space="preserve"> </w:t>
-      </w:r>
-      <w:r>
-        <w:t xml:space="preserve">to </w:t>
-      </w:r>
-      <w:r>
-        <w:rPr>
-          <w:rFonts w:ascii="Calibri" w:hAnsi="Calibri" w:cs="Calibri"/>
-        </w:rPr>
-        <w:t>proximity_threshold_mm_</w:t>
-      </w:r>
-      <w:r>
-        <w:rPr>
-          <w:rFonts w:ascii="Calibri" w:hAnsi="Calibri" w:cs="Calibri"/>
-        </w:rPr>
-        <w:t>max</w:t>
-      </w:r>
-      <w:r>
-        <w:t>)</w:t>
-      </w:r>
-      <w:r>
-        <w:t>. At least one fish must be</w:t>
+        <w:t xml:space="preserve">. </w:t>
+      </w:r>
+      <w:r>
+        <w:t xml:space="preserve">Proximity can be defined using either closest distance or head-to-head distance. </w:t>
+      </w:r>
+      <w:r>
+        <w:t>At least one fish must be</w:t>
       </w:r>
       <w:r>
         <w:t xml:space="preserve"> moving, </w:t>
@@ -2466,6 +2788,15 @@
         <w:t xml:space="preserve">. </w:t>
       </w:r>
       <w:r>
+        <w:t xml:space="preserve">We may require </w:t>
+      </w:r>
+      <w:r>
+        <w:t>an overall minimal duration for the maintenance behavior</w:t>
+      </w:r>
+      <w:r>
+        <w:t xml:space="preserve">. </w:t>
+      </w:r>
+      <w:r>
         <w:t xml:space="preserve">The motion </w:t>
       </w:r>
       <w:r>
@@ -2483,13 +2814,17 @@
     </w:p>
     <w:p>
       <w:r>
-        <w:t>Possibly r</w:t>
-      </w:r>
-      <w:r>
-        <w:t>equiring an overall minimal duration for the maintenance behavior.</w:t>
-      </w:r>
-    </w:p>
-    <w:p/>
+        <w:t xml:space="preserve">As implemented in </w:t>
+      </w:r>
+      <w:proofErr w:type="gramStart"/>
+      <w:r>
+        <w:t>April,</w:t>
+      </w:r>
+      <w:proofErr w:type="gramEnd"/>
+      <w:r>
+        <w:t xml:space="preserve"> 2026, we assess two different proximity ranges:</w:t>
+      </w:r>
+    </w:p>
     <w:p>
       <w:pPr>
         <w:rPr>
@@ -2506,6 +2841,7 @@
       </w:r>
     </w:p>
     <w:p>
+      <w:proofErr w:type="spellStart"/>
       <w:r>
         <w:rPr>
           <w:rFonts w:ascii="Calibri" w:hAnsi="Calibri" w:cs="Calibri"/>
@@ -2518,11 +2854,39 @@
         </w:rPr>
         <w:t>_threshold</w:t>
       </w:r>
+      <w:proofErr w:type="spellEnd"/>
       <w:r>
         <w:t xml:space="preserve"> = 9 mm/s</w:t>
       </w:r>
     </w:p>
     <w:p>
+      <w:proofErr w:type="spellStart"/>
+      <w:r>
+        <w:rPr>
+          <w:rFonts w:ascii="Calibri" w:hAnsi="Calibri" w:cs="Calibri"/>
+        </w:rPr>
+        <w:t>max_motion_gap_s</w:t>
+      </w:r>
+      <w:proofErr w:type="spellEnd"/>
+      <w:r>
+        <w:t xml:space="preserve"> = 0.5 s (12.5 frames at 25 fps)</w:t>
+      </w:r>
+    </w:p>
+    <w:p>
+      <w:proofErr w:type="spellStart"/>
+      <w:r>
+        <w:rPr>
+          <w:rFonts w:ascii="Calibri" w:hAnsi="Calibri" w:cs="Calibri"/>
+        </w:rPr>
+        <w:t>min_proximity_duration_s</w:t>
+      </w:r>
+      <w:proofErr w:type="spellEnd"/>
+      <w:r>
+        <w:t xml:space="preserve"> = 0.0 s</w:t>
+      </w:r>
+    </w:p>
+    <w:p>
+      <w:proofErr w:type="spellStart"/>
       <w:r>
         <w:rPr>
           <w:rFonts w:ascii="Calibri" w:hAnsi="Calibri" w:cs="Calibri"/>
@@ -2541,11 +2905,21 @@
         </w:rPr>
         <w:t>_mm</w:t>
       </w:r>
-      <w:r>
-        <w:t xml:space="preserve"> = </w:t>
-      </w:r>
-      <w:r>
-        <w:t>5-15</w:t>
+      <w:proofErr w:type="spellEnd"/>
+      <w:r>
+        <w:t xml:space="preserve"> </w:t>
+      </w:r>
+      <w:r>
+        <w:t>for range #1</w:t>
+      </w:r>
+      <w:r>
+        <w:t xml:space="preserve">= </w:t>
+      </w:r>
+      <w:r>
+        <w:t>0</w:t>
+      </w:r>
+      <w:r>
+        <w:t>-5</w:t>
       </w:r>
       <w:r>
         <w:t xml:space="preserve"> mm</w:t>
@@ -2556,40 +2930,64 @@
         <w:rPr>
           <w:rFonts w:ascii="Calibri" w:hAnsi="Calibri" w:cs="Calibri"/>
         </w:rPr>
-        <w:t>max_motion_gap_s</w:t>
-      </w:r>
-      <w:r>
-        <w:t xml:space="preserve"> = 0.</w:t>
-      </w:r>
-      <w:r>
-        <w:t>5</w:t>
-      </w:r>
-      <w:r>
-        <w:t xml:space="preserve"> s (</w:t>
-      </w:r>
-      <w:r>
-        <w:t>12.5</w:t>
-      </w:r>
-      <w:r>
-        <w:t xml:space="preserve"> frames at 25 fps)</w:t>
-      </w:r>
-    </w:p>
-    <w:p>
-      <w:r>
-        <w:rPr>
-          <w:rFonts w:ascii="Calibri" w:hAnsi="Calibri" w:cs="Calibri"/>
-        </w:rPr>
-        <w:t>min_proximity_duration_s</w:t>
-      </w:r>
-      <w:r>
-        <w:t xml:space="preserve"> = 0.</w:t>
-      </w:r>
-      <w:r>
-        <w:t>0</w:t>
-      </w:r>
-      <w:r>
-        <w:t xml:space="preserve"> s</w:t>
-      </w:r>
+        <w:t>proximity_1_distance_measure</w:t>
+      </w:r>
+      <w:r>
+        <w:t xml:space="preserve"> for range #1: closest</w:t>
+      </w:r>
+    </w:p>
+    <w:p>
+      <w:proofErr w:type="spellStart"/>
+      <w:r>
+        <w:rPr>
+          <w:rFonts w:ascii="Calibri" w:hAnsi="Calibri" w:cs="Calibri"/>
+        </w:rPr>
+        <w:t>proximity</w:t>
+      </w:r>
+      <w:r>
+        <w:rPr>
+          <w:rFonts w:ascii="Calibri" w:hAnsi="Calibri" w:cs="Calibri"/>
+        </w:rPr>
+        <w:t>_threshold</w:t>
+      </w:r>
+      <w:r>
+        <w:rPr>
+          <w:rFonts w:ascii="Calibri" w:hAnsi="Calibri" w:cs="Calibri"/>
+        </w:rPr>
+        <w:t>_mm</w:t>
+      </w:r>
+      <w:proofErr w:type="spellEnd"/>
+      <w:r>
+        <w:t xml:space="preserve"> for range #</w:t>
+      </w:r>
+      <w:r>
+        <w:t xml:space="preserve">2 </w:t>
+      </w:r>
+      <w:r>
+        <w:t>= 5-15 mm</w:t>
+      </w:r>
+    </w:p>
+    <w:p>
+      <w:r>
+        <w:rPr>
+          <w:rFonts w:ascii="Calibri" w:hAnsi="Calibri" w:cs="Calibri"/>
+        </w:rPr>
+        <w:t>proximity_1_distance_measure</w:t>
+      </w:r>
+      <w:r>
+        <w:t xml:space="preserve"> for range #</w:t>
+      </w:r>
+      <w:r>
+        <w:t>2</w:t>
+      </w:r>
+      <w:r>
+        <w:t xml:space="preserve">: </w:t>
+      </w:r>
+      <w:proofErr w:type="spellStart"/>
+      <w:r>
+        <w:t>head_to_head</w:t>
+      </w:r>
+      <w:proofErr w:type="spellEnd"/>
     </w:p>
     <w:p/>
     <w:p>
@@ -2607,6 +3005,100 @@
       </w:pPr>
       <w:r>
         <w:lastRenderedPageBreak/>
+        <w:t>Turning</w:t>
+      </w:r>
+    </w:p>
+    <w:p>
+      <w:r>
+        <w:t xml:space="preserve">Calculate a turning angle from the change in fish heading angle. To associate a turning angle with each frame </w:t>
+      </w:r>
+      <w:r>
+        <w:rPr>
+          <w:i/>
+          <w:iCs/>
+        </w:rPr>
+        <w:t>j</w:t>
+      </w:r>
+      <w:r>
+        <w:t>, calculate a change in heading angle ∆</w:t>
+      </w:r>
+      <w:proofErr w:type="spellStart"/>
+      <w:r>
+        <w:t>θ</w:t>
+      </w:r>
+      <w:r>
+        <w:rPr>
+          <w:vertAlign w:val="subscript"/>
+        </w:rPr>
+        <w:t>heading</w:t>
+      </w:r>
+      <w:proofErr w:type="spellEnd"/>
+      <w:r>
+        <w:t xml:space="preserve">[j] = </w:t>
+      </w:r>
+      <w:proofErr w:type="spellStart"/>
+      <w:r>
+        <w:t>θ</w:t>
+      </w:r>
+      <w:r>
+        <w:rPr>
+          <w:vertAlign w:val="subscript"/>
+        </w:rPr>
+        <w:t>heading</w:t>
+      </w:r>
+      <w:proofErr w:type="spellEnd"/>
+      <w:r>
+        <w:t xml:space="preserve">[j+1] - </w:t>
+      </w:r>
+      <w:proofErr w:type="spellStart"/>
+      <w:r>
+        <w:t>θ</w:t>
+      </w:r>
+      <w:r>
+        <w:rPr>
+          <w:vertAlign w:val="subscript"/>
+        </w:rPr>
+        <w:t>heading</w:t>
+      </w:r>
+      <w:proofErr w:type="spellEnd"/>
+      <w:r>
+        <w:t>[j-1]. Define turning angle ∆</w:t>
+      </w:r>
+      <w:proofErr w:type="spellStart"/>
+      <w:r>
+        <w:t>θ</w:t>
+      </w:r>
+      <w:r>
+        <w:rPr>
+          <w:vertAlign w:val="subscript"/>
+        </w:rPr>
+        <w:t>turning</w:t>
+      </w:r>
+      <w:proofErr w:type="spellEnd"/>
+      <w:r>
+        <w:t xml:space="preserve"> as –∆</w:t>
+      </w:r>
+      <w:proofErr w:type="spellStart"/>
+      <w:r>
+        <w:t>θ</w:t>
+      </w:r>
+      <w:r>
+        <w:rPr>
+          <w:vertAlign w:val="subscript"/>
+        </w:rPr>
+        <w:t>heading</w:t>
+      </w:r>
+      <w:proofErr w:type="spellEnd"/>
+      <w:r>
+        <w:t>, so that positive = rightward turn.</w:t>
+      </w:r>
+    </w:p>
+    <w:p/>
+    <w:p>
+      <w:pPr>
+        <w:pStyle w:val="Heading2"/>
+      </w:pPr>
+      <w:r>
         <w:t>Bending (general)</w:t>
       </w:r>
     </w:p>
@@ -2614,6 +3106,7 @@
       <w:r>
         <w:t xml:space="preserve">Calculate a bend angle </w:t>
       </w:r>
+      <w:proofErr w:type="spellStart"/>
       <w:r>
         <w:rPr>
           <w:rFonts w:ascii="Calibri" w:hAnsi="Calibri" w:cs="Calibri"/>
@@ -2626,11 +3119,9 @@
         </w:rPr>
         <w:t>bend</w:t>
       </w:r>
-      <w:r>
-        <w:t xml:space="preserve"> </w:t>
-      </w:r>
-      <w:r>
-        <w:t>as follows: Consider all points from the midpoint to the anterior-most point; fit a line to these. Similarly fit a line for points from the midpoint to the posterior-most point. Determine the angle between these best-fit lines. Denote the supplement of this (i.e. π – this angle) as the bend angle, so that 0 is a straight fish. Use the bend angle to categories various bends (see below).</w:t>
+      <w:proofErr w:type="spellEnd"/>
+      <w:r>
+        <w:t xml:space="preserve"> as follows: Consider all points from the midpoint to the anterior-most point; fit a line to these. Similarly fit a line for points from the midpoint to the posterior-most point. Determine the angle between these best-fit lines. Denote the supplement of this (i.e. π – this angle) as the bend angle, so that 0 is a straight fish. Use the bend angle to categories various bends (see below).</w:t>
       </w:r>
     </w:p>
     <w:p>
@@ -2639,10 +3130,10 @@
           <w:noProof/>
         </w:rPr>
         <w:drawing>
-          <wp:inline distT="0" distB="0" distL="0" distR="0" wp14:anchorId="433CADBC" wp14:editId="1674E89B">
+          <wp:inline distT="0" distB="0" distL="0" distR="0" wp14:anchorId="1A3D2C0C" wp14:editId="37CF8BB9">
             <wp:extent cx="4218305" cy="1411605"/>
             <wp:effectExtent l="0" t="0" r="0" b="0"/>
-            <wp:docPr id="12467648" name="Picture 1"/>
+            <wp:docPr id="1473852214" name="Picture 1"/>
             <wp:cNvGraphicFramePr>
               <a:graphicFrameLocks xmlns:a="http://schemas.openxmlformats.org/drawingml/2006/main" noChangeAspect="1"/>
             </wp:cNvGraphicFramePr>
@@ -2721,6 +3212,8 @@
       <w:r>
         <w:t>(</w:t>
       </w:r>
+      <w:proofErr w:type="spellStart"/>
+      <w:proofErr w:type="gramStart"/>
       <w:r>
         <w:rPr>
           <w:rFonts w:asciiTheme="majorHAnsi" w:hAnsiTheme="majorHAnsi" w:cstheme="majorHAnsi"/>
@@ -2734,9 +3227,12 @@
         </w:rPr>
         <w:t>min</w:t>
       </w:r>
+      <w:proofErr w:type="spellEnd"/>
+      <w:proofErr w:type="gramEnd"/>
       <w:r>
         <w:t xml:space="preserve">, </w:t>
       </w:r>
+      <w:proofErr w:type="spellStart"/>
       <w:r>
         <w:rPr>
           <w:rFonts w:asciiTheme="majorHAnsi" w:hAnsiTheme="majorHAnsi" w:cstheme="majorHAnsi"/>
@@ -2750,14 +3246,21 @@
         </w:rPr>
         <w:t>Jmax</w:t>
       </w:r>
-      <w:r>
-        <w:t>] : J-bend</w:t>
+      <w:proofErr w:type="spellEnd"/>
+      <w:proofErr w:type="gramStart"/>
+      <w:r>
+        <w:t>] :</w:t>
+      </w:r>
+      <w:proofErr w:type="gramEnd"/>
+      <w:r>
+        <w:t xml:space="preserve"> J-bend</w:t>
       </w:r>
     </w:p>
     <w:p>
       <w:r>
         <w:t>(</w:t>
       </w:r>
+      <w:proofErr w:type="spellStart"/>
       <w:r>
         <w:rPr>
           <w:rFonts w:asciiTheme="majorHAnsi" w:hAnsiTheme="majorHAnsi" w:cstheme="majorHAnsi"/>
@@ -2771,9 +3274,11 @@
         </w:rPr>
         <w:t>Jmax</w:t>
       </w:r>
+      <w:proofErr w:type="spellEnd"/>
       <w:r>
         <w:t xml:space="preserve">, </w:t>
       </w:r>
+      <w:proofErr w:type="spellStart"/>
       <w:r>
         <w:rPr>
           <w:rFonts w:asciiTheme="majorHAnsi" w:hAnsiTheme="majorHAnsi" w:cstheme="majorHAnsi"/>
@@ -2787,14 +3292,21 @@
         </w:rPr>
         <w:t>Cmin</w:t>
       </w:r>
-      <w:r>
-        <w:t>] : R-bend (routine turn)</w:t>
+      <w:proofErr w:type="spellEnd"/>
+      <w:proofErr w:type="gramStart"/>
+      <w:r>
+        <w:t>] :</w:t>
+      </w:r>
+      <w:proofErr w:type="gramEnd"/>
+      <w:r>
+        <w:t xml:space="preserve"> R-bend (routine turn)</w:t>
       </w:r>
     </w:p>
     <w:p>
       <w:r>
         <w:t>(</w:t>
       </w:r>
+      <w:proofErr w:type="spellStart"/>
       <w:r>
         <w:rPr>
           <w:rFonts w:asciiTheme="majorHAnsi" w:hAnsiTheme="majorHAnsi" w:cstheme="majorHAnsi"/>
@@ -2808,14 +3320,24 @@
         </w:rPr>
         <w:t>Cmin</w:t>
       </w:r>
-      <w:r>
-        <w:t>, π] : C-bend</w:t>
+      <w:proofErr w:type="spellEnd"/>
+      <w:r>
+        <w:t>, π</w:t>
+      </w:r>
+      <w:proofErr w:type="gramStart"/>
+      <w:r>
+        <w:t>] :</w:t>
+      </w:r>
+      <w:proofErr w:type="gramEnd"/>
+      <w:r>
+        <w:t xml:space="preserve"> C-bend</w:t>
       </w:r>
     </w:p>
     <w:p>
       <w:r>
         <w:t xml:space="preserve">Consider contiguous blocks of frames with bending angle &gt; </w:t>
       </w:r>
+      <w:proofErr w:type="spellStart"/>
       <w:r>
         <w:rPr>
           <w:rFonts w:asciiTheme="majorHAnsi" w:hAnsiTheme="majorHAnsi" w:cstheme="majorHAnsi"/>
@@ -2829,6 +3351,7 @@
         </w:rPr>
         <w:t>min</w:t>
       </w:r>
+      <w:proofErr w:type="spellEnd"/>
       <w:r>
         <w:t>. Assign the bending behavior for the whole block as the type (J, R, C) corresponding to the maximum bending angle of that sequence</w:t>
       </w:r>
@@ -2850,6 +3373,7 @@
       </w:r>
     </w:p>
     <w:p>
+      <w:proofErr w:type="spellStart"/>
       <w:r>
         <w:rPr>
           <w:rFonts w:asciiTheme="majorHAnsi" w:hAnsiTheme="majorHAnsi" w:cstheme="majorHAnsi"/>
@@ -2863,6 +3387,7 @@
         </w:rPr>
         <w:t>min</w:t>
       </w:r>
+      <w:proofErr w:type="spellEnd"/>
       <w:r>
         <w:rPr>
           <w:rFonts w:asciiTheme="majorHAnsi" w:hAnsiTheme="majorHAnsi" w:cstheme="majorHAnsi"/>
@@ -2874,6 +3399,7 @@
       </w:r>
     </w:p>
     <w:p>
+      <w:proofErr w:type="spellStart"/>
       <w:r>
         <w:rPr>
           <w:rFonts w:asciiTheme="majorHAnsi" w:hAnsiTheme="majorHAnsi" w:cstheme="majorHAnsi"/>
@@ -2887,6 +3413,7 @@
         </w:rPr>
         <w:t>Jmax</w:t>
       </w:r>
+      <w:proofErr w:type="spellEnd"/>
       <w:r>
         <w:rPr>
           <w:rFonts w:asciiTheme="majorHAnsi" w:hAnsiTheme="majorHAnsi" w:cstheme="majorHAnsi"/>
@@ -2898,6 +3425,7 @@
       </w:r>
     </w:p>
     <w:p>
+      <w:proofErr w:type="spellStart"/>
       <w:r>
         <w:rPr>
           <w:rFonts w:asciiTheme="majorHAnsi" w:hAnsiTheme="majorHAnsi" w:cstheme="majorHAnsi"/>
@@ -2911,6 +3439,7 @@
         </w:rPr>
         <w:t>Cmin</w:t>
       </w:r>
+      <w:proofErr w:type="spellEnd"/>
       <w:r>
         <w:rPr>
           <w:rFonts w:asciiTheme="majorHAnsi" w:hAnsiTheme="majorHAnsi" w:cstheme="majorHAnsi"/>
@@ -2933,7 +3462,15 @@
     </w:p>
     <w:p>
       <w:r>
-        <w:t xml:space="preserve">The following are not identified as discrete events, but </w:t>
+        <w:t xml:space="preserve">The following are not identified as discrete </w:t>
+      </w:r>
+      <w:proofErr w:type="gramStart"/>
+      <w:r>
+        <w:t>events, but</w:t>
+      </w:r>
+      <w:proofErr w:type="gramEnd"/>
+      <w:r>
+        <w:t xml:space="preserve"> </w:t>
       </w:r>
       <w:r>
         <w:t xml:space="preserve">rather </w:t>
@@ -3624,7 +4161,23 @@
     </w:p>
     <w:p>
       <w:r>
-        <w:t>If the two fish maintain the same relative angles, Xcorr = 1; if they are uncorrelated, Xcorr = 0.</w:t>
+        <w:t xml:space="preserve">If the two fish maintain the same relative angles, </w:t>
+      </w:r>
+      <w:proofErr w:type="spellStart"/>
+      <w:r>
+        <w:t>Xcorr</w:t>
+      </w:r>
+      <w:proofErr w:type="spellEnd"/>
+      <w:r>
+        <w:t xml:space="preserve"> = 1; if they are uncorrelated, </w:t>
+      </w:r>
+      <w:proofErr w:type="spellStart"/>
+      <w:r>
+        <w:t>Xcorr</w:t>
+      </w:r>
+      <w:proofErr w:type="spellEnd"/>
+      <w:r>
+        <w:t xml:space="preserve"> = 0.</w:t>
       </w:r>
     </w:p>
     <w:p>
@@ -3730,14 +4283,14 @@
       <w:r>
         <w:t xml:space="preserve"> = vector from Fish 1 to Fish 2; calculate </w:t>
       </w:r>
-      <w:bookmarkStart w:id="4" w:name="_Hlk169032880"/>
+      <w:bookmarkStart w:id="3" w:name="_Hlk169032880"/>
       <w:r>
         <w:rPr>
           <w:rFonts w:ascii="Calibri" w:hAnsi="Calibri" w:cs="Calibri"/>
         </w:rPr>
         <w:t>φ</w:t>
       </w:r>
-      <w:bookmarkEnd w:id="4"/>
+      <w:bookmarkEnd w:id="3"/>
       <w:r>
         <w:rPr>
           <w:vertAlign w:val="subscript"/>
@@ -3745,8 +4298,13 @@
         <w:t>1</w:t>
       </w:r>
       <w:r>
-        <w:t xml:space="preserve"> = Angle(</w:t>
-      </w:r>
+        <w:t xml:space="preserve"> = </w:t>
+      </w:r>
+      <w:proofErr w:type="gramStart"/>
+      <w:r>
+        <w:t>Angle(</w:t>
+      </w:r>
+      <w:proofErr w:type="gramEnd"/>
       <w:r>
         <w:rPr>
           <w:rFonts w:ascii="Calibri" w:hAnsi="Calibri" w:cs="Calibri"/>
@@ -3791,8 +4349,13 @@
         <w:t>2</w:t>
       </w:r>
       <w:r>
-        <w:t xml:space="preserve"> = Angle(</w:t>
-      </w:r>
+        <w:t xml:space="preserve"> = </w:t>
+      </w:r>
+      <w:proofErr w:type="gramStart"/>
+      <w:r>
+        <w:t>Angle(</w:t>
+      </w:r>
+      <w:proofErr w:type="gramEnd"/>
       <w:r>
         <w:rPr>
           <w:rFonts w:ascii="Calibri" w:hAnsi="Calibri" w:cs="Calibri"/>
@@ -3824,6 +4387,7 @@
       <w:r>
         <w:t xml:space="preserve">), where </w:t>
       </w:r>
+      <w:proofErr w:type="spellStart"/>
       <w:r>
         <w:rPr>
           <w:rFonts w:ascii="Calibri" w:hAnsi="Calibri" w:cs="Calibri"/>
@@ -3836,9 +4400,11 @@
         </w:rPr>
         <w:t>i</w:t>
       </w:r>
+      <w:proofErr w:type="spellEnd"/>
       <w:r>
         <w:t xml:space="preserve"> is the heading angle for Fish </w:t>
       </w:r>
+      <w:proofErr w:type="spellStart"/>
       <w:r>
         <w:rPr>
           <w:i/>
@@ -3846,6 +4412,7 @@
         </w:rPr>
         <w:t>i</w:t>
       </w:r>
+      <w:proofErr w:type="spellEnd"/>
       <w:r>
         <w:t xml:space="preserve">. These </w:t>
       </w:r>
@@ -3894,6 +4461,10 @@
       <w:r>
         <w:t xml:space="preserve"> Note that </w:t>
       </w:r>
+      <w:r>
+        <w:t>|</w:t>
+      </w:r>
+      <w:proofErr w:type="spellStart"/>
       <w:r>
         <w:rPr>
           <w:rFonts w:ascii="Calibri" w:hAnsi="Calibri" w:cs="Calibri"/>
@@ -3909,6 +4480,7 @@
         </w:rPr>
         <w:t>i</w:t>
       </w:r>
+      <w:proofErr w:type="spellEnd"/>
       <w:r>
         <w:rPr>
           <w:vertAlign w:val="subscript"/>
@@ -3916,6 +4488,9 @@
         <w:t xml:space="preserve"> </w:t>
       </w:r>
       <w:r>
+        <w:t xml:space="preserve">| </w:t>
+      </w:r>
+      <w:r>
         <w:t xml:space="preserve">&lt; </w:t>
       </w:r>
       <w:r>
@@ -3925,8 +4500,15 @@
         <w:t>π</w:t>
       </w:r>
       <w:r>
-        <w:t xml:space="preserve"> /2 corresponds to Fish </w:t>
-      </w:r>
+        <w:t xml:space="preserve"> /2 corresponds to </w:t>
+      </w:r>
+      <w:r>
+        <w:t>f</w:t>
+      </w:r>
+      <w:r>
+        <w:t xml:space="preserve">ish </w:t>
+      </w:r>
+      <w:proofErr w:type="spellStart"/>
       <w:r>
         <w:rPr>
           <w:i/>
@@ -3934,8 +4516,55 @@
         </w:rPr>
         <w:t>i</w:t>
       </w:r>
-      <w:r>
-        <w:t xml:space="preserve"> facing towards the other fish.</w:t>
+      <w:proofErr w:type="spellEnd"/>
+      <w:r>
+        <w:t xml:space="preserve"> facing towards the other fish</w:t>
+      </w:r>
+      <w:r>
+        <w:t xml:space="preserve">, and </w:t>
+      </w:r>
+      <w:proofErr w:type="spellStart"/>
+      <w:r>
+        <w:rPr>
+          <w:rFonts w:ascii="Calibri" w:hAnsi="Calibri" w:cs="Calibri"/>
+        </w:rPr>
+        <w:t>φ</w:t>
+      </w:r>
+      <w:proofErr w:type="gramStart"/>
+      <w:r>
+        <w:rPr>
+          <w:rFonts w:ascii="Calibri" w:hAnsi="Calibri" w:cs="Calibri"/>
+          <w:i/>
+          <w:iCs/>
+          <w:vertAlign w:val="subscript"/>
+        </w:rPr>
+        <w:t>i</w:t>
+      </w:r>
+      <w:proofErr w:type="spellEnd"/>
+      <w:r>
+        <w:rPr>
+          <w:vertAlign w:val="subscript"/>
+        </w:rPr>
+        <w:t xml:space="preserve"> </w:t>
+      </w:r>
+      <w:r>
+        <w:t xml:space="preserve"> &lt;</w:t>
+      </w:r>
+      <w:proofErr w:type="gramEnd"/>
+      <w:r>
+        <w:t xml:space="preserve"> 0 corresponds to the other fish being to the left of fish </w:t>
+      </w:r>
+      <w:proofErr w:type="spellStart"/>
+      <w:r>
+        <w:rPr>
+          <w:i/>
+          <w:iCs/>
+        </w:rPr>
+        <w:t>i</w:t>
+      </w:r>
+      <w:proofErr w:type="spellEnd"/>
+      <w:r>
+        <w:t>.</w:t>
       </w:r>
     </w:p>
     <w:p/>
@@ -4069,7 +4698,15 @@
         <w:t xml:space="preserve">Proximity to the dish edge. </w:t>
       </w:r>
       <w:r>
-        <w:t xml:space="preserve">Data from frames in which either fish is within </w:t>
+        <w:t xml:space="preserve">Data from frames in which </w:t>
+      </w:r>
+      <w:proofErr w:type="gramStart"/>
+      <w:r>
+        <w:t>either fish</w:t>
+      </w:r>
+      <w:proofErr w:type="gramEnd"/>
+      <w:r>
+        <w:t xml:space="preserve"> is within </w:t>
       </w:r>
       <w:r>
         <w:t>a threshold distance</w:t>
@@ -4077,6 +4714,7 @@
       <w:r>
         <w:t xml:space="preserve"> </w:t>
       </w:r>
+      <w:proofErr w:type="spellStart"/>
       <w:r>
         <w:rPr>
           <w:rFonts w:ascii="Calibri" w:hAnsi="Calibri" w:cs="Calibri"/>
@@ -4089,6 +4727,7 @@
         </w:rPr>
         <w:t>edge</w:t>
       </w:r>
+      <w:proofErr w:type="spellEnd"/>
       <w:r>
         <w:t xml:space="preserve"> </w:t>
       </w:r>
@@ -4115,10 +4754,18 @@
         <w:t xml:space="preserve"> Data from frames in which the tracking software fails to detect </w:t>
       </w:r>
       <w:r>
-        <w:t xml:space="preserve">one or both of the </w:t>
-      </w:r>
-      <w:r>
-        <w:t xml:space="preserve">two fish are discarded, </w:t>
+        <w:t xml:space="preserve">one or </w:t>
+      </w:r>
+      <w:proofErr w:type="gramStart"/>
+      <w:r>
+        <w:t xml:space="preserve">both of the </w:t>
+      </w:r>
+      <w:r>
+        <w:t>two</w:t>
+      </w:r>
+      <w:proofErr w:type="gramEnd"/>
+      <w:r>
+        <w:t xml:space="preserve"> fish are discarded, </w:t>
       </w:r>
       <w:r>
         <w:t>though they may be used to</w:t>
@@ -4133,7 +4780,15 @@
         <w:t>contact events (see “Contact”).</w:t>
       </w:r>
       <w:r>
-        <w:t xml:space="preserve"> Specifically, tracking is considered “bad” if one or more body positions for either fish are recorded as zero. In addition, tracking is “bad” if the distance between positions 1 and 2 (head-body) is more than 3 times the mean distance between positions </w:t>
+        <w:t xml:space="preserve"> Specifically, tracking is considered “bad” if one or more body positions for </w:t>
+      </w:r>
+      <w:proofErr w:type="gramStart"/>
+      <w:r>
+        <w:t>either fish</w:t>
+      </w:r>
+      <w:proofErr w:type="gramEnd"/>
+      <w:r>
+        <w:t xml:space="preserve"> are recorded as zero. In addition, tracking is “bad” if the distance between positions 1 and 2 (head-body) is more than 3 times the mean distance between positions </w:t>
       </w:r>
       <w:r>
         <w:t>j and j+1 for j = 2 to 9.</w:t>
@@ -4155,6 +4810,7 @@
       </w:r>
     </w:p>
     <w:p>
+      <w:proofErr w:type="spellStart"/>
       <w:r>
         <w:rPr>
           <w:rFonts w:ascii="Calibri" w:hAnsi="Calibri" w:cs="Calibri"/>
@@ -4167,6 +4823,7 @@
         </w:rPr>
         <w:t>edge</w:t>
       </w:r>
+      <w:proofErr w:type="spellEnd"/>
       <w:r>
         <w:t xml:space="preserve"> = 5 mm</w:t>
       </w:r>
@@ -4191,7 +4848,19 @@
     </w:p>
     <w:p>
       <w:r>
-        <w:t>A fish body shows a J-shaped bend, with a straight anterior half and a curved posterior. This is assessed specifically by (i) the straightness of the anterior points: principal component analysis of the (x, y) values of body-points 1 through 5 has at least r</w:t>
+        <w:t>A fish body shows a J-shaped bend, with a straight anterior half and a curved posterior. This is assessed specifically by (</w:t>
+      </w:r>
+      <w:proofErr w:type="spellStart"/>
+      <w:r>
+        <w:t>i</w:t>
+      </w:r>
+      <w:proofErr w:type="spellEnd"/>
+      <w:r>
+        <w:t xml:space="preserve">) the straightness of the anterior points: principal component analysis of the (x, y) values of body-points 1 through 5 has at least </w:t>
+      </w:r>
+      <w:proofErr w:type="spellStart"/>
+      <w:r>
+        <w:t>r</w:t>
       </w:r>
       <w:r>
         <w:rPr>
@@ -4199,9 +4868,11 @@
         </w:rPr>
         <w:t>AP</w:t>
       </w:r>
+      <w:proofErr w:type="spellEnd"/>
       <w:r>
         <w:t xml:space="preserve"> of the total variance, (ii) the angle of the last segment </w:t>
       </w:r>
+      <w:proofErr w:type="spellStart"/>
       <w:r>
         <w:rPr>
           <w:rFonts w:ascii="Calibri" w:hAnsi="Calibri" w:cs="Calibri"/>
@@ -4214,6 +4885,7 @@
         </w:rPr>
         <w:t>N</w:t>
       </w:r>
+      <w:proofErr w:type="spellEnd"/>
       <w:r>
         <w:t xml:space="preserve"> relative to the heading angle</w:t>
       </w:r>
@@ -4232,6 +4904,7 @@
       <w:r>
         <w:t xml:space="preserve"> is near ± 90 degrees: |cos(</w:t>
       </w:r>
+      <w:proofErr w:type="spellStart"/>
       <w:r>
         <w:rPr>
           <w:rFonts w:ascii="Calibri" w:hAnsi="Calibri" w:cs="Calibri"/>
@@ -4244,6 +4917,7 @@
         </w:rPr>
         <w:t>N</w:t>
       </w:r>
+      <w:proofErr w:type="spellEnd"/>
       <w:r>
         <w:rPr>
           <w:rFonts w:ascii="Calibri" w:hAnsi="Calibri" w:cs="Calibri"/>
@@ -4259,6 +4933,7 @@
       <w:r>
         <w:t xml:space="preserve">)| &lt; </w:t>
       </w:r>
+      <w:proofErr w:type="spellStart"/>
       <w:r>
         <w:rPr>
           <w:rFonts w:ascii="Calibri" w:hAnsi="Calibri" w:cs="Calibri"/>
@@ -4271,6 +4946,7 @@
         </w:rPr>
         <w:t>cosThetaN</w:t>
       </w:r>
+      <w:proofErr w:type="spellEnd"/>
       <w:r>
         <w:t xml:space="preserve"> , and </w:t>
       </w:r>
@@ -4385,6 +5061,7 @@
       </w:r>
     </w:p>
     <w:p>
+      <w:proofErr w:type="spellStart"/>
       <w:r>
         <w:rPr>
           <w:rFonts w:ascii="Calibri" w:hAnsi="Calibri" w:cs="Calibri"/>
@@ -4397,11 +5074,13 @@
         </w:rPr>
         <w:t>AP</w:t>
       </w:r>
+      <w:proofErr w:type="spellEnd"/>
       <w:r>
         <w:t xml:space="preserve"> = 0.98</w:t>
       </w:r>
     </w:p>
     <w:p>
+      <w:proofErr w:type="spellStart"/>
       <w:r>
         <w:rPr>
           <w:rFonts w:ascii="Calibri" w:hAnsi="Calibri" w:cs="Calibri"/>
@@ -4414,6 +5093,7 @@
         </w:rPr>
         <w:t>cosThetaN</w:t>
       </w:r>
+      <w:proofErr w:type="spellEnd"/>
       <w:r>
         <w:t xml:space="preserve"> = 0.34 (90 ± 20 degrees)</w:t>
       </w:r>
@@ -4510,6 +5190,7 @@
       <w:r>
         <w:t xml:space="preserve">A fish body shows a sharp bend. This is assessed by the ratio of the head-to-tail-end distance / the overall fish length (sum of segments), with a bending “event” identified as ratio &lt; </w:t>
       </w:r>
+      <w:proofErr w:type="spellStart"/>
       <w:r>
         <w:rPr>
           <w:rFonts w:ascii="Calibri" w:hAnsi="Calibri" w:cs="Calibri"/>
@@ -4528,6 +5209,7 @@
         </w:rPr>
         <w:t>d_threshold</w:t>
       </w:r>
+      <w:proofErr w:type="spellEnd"/>
       <w:r>
         <w:t>. Use as the threshold the ratio of the diameter to semi-circle arc length of a circle, i.e. an opening angle of 180 degrees, i.e. the fish body is as curved as a half-circle. For 180 degrees, this ratio is 2/</w:t>
       </w:r>
@@ -4557,6 +5239,7 @@
       </w:r>
     </w:p>
     <w:p>
+      <w:proofErr w:type="spellStart"/>
       <w:r>
         <w:rPr>
           <w:rFonts w:ascii="Calibri" w:hAnsi="Calibri" w:cs="Calibri"/>
@@ -4575,6 +5258,7 @@
         </w:rPr>
         <w:t>d_threshold</w:t>
       </w:r>
+      <w:proofErr w:type="spellEnd"/>
       <w:r>
         <w:t xml:space="preserve"> = 2/</w:t>
       </w:r>
@@ -4671,12 +5355,14 @@
       <w:r>
         <w:t xml:space="preserve">Identify circling by fitting a circle to the head positions of both fish over some window of frames, </w:t>
       </w:r>
+      <w:proofErr w:type="spellStart"/>
       <w:r>
         <w:rPr>
           <w:rFonts w:asciiTheme="minorHAnsi" w:hAnsiTheme="minorHAnsi" w:cstheme="minorHAnsi"/>
         </w:rPr>
         <w:t>circle_windowsize</w:t>
       </w:r>
+      <w:proofErr w:type="spellEnd"/>
       <w:r>
         <w:t>, and assessing whether the following criteria are met over all window frames:</w:t>
       </w:r>
@@ -4689,18 +5375,41 @@
           <w:numId w:val="1"/>
         </w:numPr>
       </w:pPr>
-      <w:r>
-        <w:t xml:space="preserve">the two fish are close to each other; specifically d &lt; </w:t>
-      </w:r>
-      <w:r>
-        <w:rPr>
-          <w:rFonts w:ascii="Calibri" w:hAnsi="Calibri" w:cs="Calibri"/>
-        </w:rPr>
-        <w:t>circle_distance_threshold</w:t>
-      </w:r>
+      <w:proofErr w:type="gramStart"/>
+      <w:r>
+        <w:t>the</w:t>
+      </w:r>
+      <w:proofErr w:type="gramEnd"/>
+      <w:r>
+        <w:t xml:space="preserve"> two fish are close to each other; </w:t>
+      </w:r>
+      <w:proofErr w:type="gramStart"/>
+      <w:r>
+        <w:t>specifically</w:t>
+      </w:r>
+      <w:proofErr w:type="gramEnd"/>
+      <w:r>
+        <w:t xml:space="preserve"> d &lt; </w:t>
+      </w:r>
+      <w:proofErr w:type="spellStart"/>
+      <w:r>
+        <w:rPr>
+          <w:rFonts w:ascii="Calibri" w:hAnsi="Calibri" w:cs="Calibri"/>
+        </w:rPr>
+        <w:t>circle_distance_</w:t>
+      </w:r>
+      <w:proofErr w:type="gramStart"/>
+      <w:r>
+        <w:rPr>
+          <w:rFonts w:ascii="Calibri" w:hAnsi="Calibri" w:cs="Calibri"/>
+        </w:rPr>
+        <w:t>threshold</w:t>
+      </w:r>
+      <w:proofErr w:type="spellEnd"/>
       <w:r>
         <w:t xml:space="preserve"> .</w:t>
       </w:r>
+      <w:proofErr w:type="gramEnd"/>
       <w:r>
         <w:t xml:space="preserve"> </w:t>
       </w:r>
@@ -4713,18 +5422,41 @@
           <w:numId w:val="1"/>
         </w:numPr>
       </w:pPr>
-      <w:r>
-        <w:t xml:space="preserve">the two fish are moving; specifically RMS displacement per frame &lt; </w:t>
-      </w:r>
-      <w:r>
-        <w:rPr>
-          <w:rFonts w:ascii="Calibri" w:hAnsi="Calibri" w:cs="Calibri"/>
-        </w:rPr>
-        <w:t>motion_threshold</w:t>
-      </w:r>
+      <w:proofErr w:type="gramStart"/>
+      <w:r>
+        <w:t>the</w:t>
+      </w:r>
+      <w:proofErr w:type="gramEnd"/>
+      <w:r>
+        <w:t xml:space="preserve"> two fish are moving; </w:t>
+      </w:r>
+      <w:proofErr w:type="gramStart"/>
+      <w:r>
+        <w:t>specifically</w:t>
+      </w:r>
+      <w:proofErr w:type="gramEnd"/>
+      <w:r>
+        <w:t xml:space="preserve"> RMS displacement per frame &lt; </w:t>
+      </w:r>
+      <w:proofErr w:type="spellStart"/>
+      <w:r>
+        <w:rPr>
+          <w:rFonts w:ascii="Calibri" w:hAnsi="Calibri" w:cs="Calibri"/>
+        </w:rPr>
+        <w:t>motion_</w:t>
+      </w:r>
+      <w:proofErr w:type="gramStart"/>
+      <w:r>
+        <w:rPr>
+          <w:rFonts w:ascii="Calibri" w:hAnsi="Calibri" w:cs="Calibri"/>
+        </w:rPr>
+        <w:t>threshold</w:t>
+      </w:r>
+      <w:proofErr w:type="spellEnd"/>
       <w:r>
         <w:t xml:space="preserve"> .</w:t>
       </w:r>
+      <w:proofErr w:type="gramEnd"/>
     </w:p>
     <w:p>
       <w:pPr>
@@ -4735,8 +5467,29 @@
         </w:numPr>
       </w:pPr>
       <w:r>
-        <w:t>the two fish have a antiparallel orientation; specifically cos(</w:t>
-      </w:r>
+        <w:t xml:space="preserve">the two fish have </w:t>
+      </w:r>
+      <w:proofErr w:type="gramStart"/>
+      <w:r>
+        <w:t>a</w:t>
+      </w:r>
+      <w:proofErr w:type="gramEnd"/>
+      <w:r>
+        <w:t xml:space="preserve"> antiparallel </w:t>
+      </w:r>
+      <w:proofErr w:type="gramStart"/>
+      <w:r>
+        <w:t>orientation;</w:t>
+      </w:r>
+      <w:proofErr w:type="gramEnd"/>
+      <w:r>
+        <w:t xml:space="preserve"> specifically </w:t>
+      </w:r>
+      <w:proofErr w:type="gramStart"/>
+      <w:r>
+        <w:t>cos(</w:t>
+      </w:r>
+      <w:proofErr w:type="gramEnd"/>
       <w:r>
         <w:rPr>
           <w:rFonts w:ascii="Calibri" w:hAnsi="Calibri" w:cs="Calibri"/>
@@ -4770,12 +5523,14 @@
       <w:r>
         <w:t xml:space="preserve">) &lt; </w:t>
       </w:r>
+      <w:proofErr w:type="spellStart"/>
       <w:r>
         <w:rPr>
           <w:rFonts w:ascii="Calibri" w:hAnsi="Calibri" w:cs="Calibri"/>
         </w:rPr>
         <w:t>cos_theta_AP_threshold</w:t>
       </w:r>
+      <w:proofErr w:type="spellEnd"/>
       <w:r>
         <w:t>.</w:t>
       </w:r>
@@ -4788,18 +5543,34 @@
           <w:numId w:val="1"/>
         </w:numPr>
       </w:pPr>
-      <w:r>
-        <w:t xml:space="preserve">their trajectories are well-fit by a circle; specifically the root-mean-squared deviation of the head positions to the best-fit circle must be less than </w:t>
-      </w:r>
+      <w:proofErr w:type="gramStart"/>
+      <w:r>
+        <w:t>their</w:t>
+      </w:r>
+      <w:proofErr w:type="gramEnd"/>
+      <w:r>
+        <w:t xml:space="preserve"> trajectories are well-fit by a circle; </w:t>
+      </w:r>
+      <w:proofErr w:type="gramStart"/>
+      <w:r>
+        <w:t>specifically</w:t>
+      </w:r>
+      <w:proofErr w:type="gramEnd"/>
+      <w:r>
+        <w:t xml:space="preserve"> the root-mean-squared deviation of the head positions to the best-fit circle must be less than </w:t>
+      </w:r>
+      <w:proofErr w:type="spellStart"/>
       <w:r>
         <w:rPr>
           <w:rFonts w:ascii="Calibri" w:hAnsi="Calibri" w:cs="Calibri"/>
         </w:rPr>
         <w:t>circle_fit_threshold</w:t>
       </w:r>
+      <w:proofErr w:type="spellEnd"/>
       <w:r>
         <w:t xml:space="preserve"> x </w:t>
       </w:r>
+      <w:proofErr w:type="gramStart"/>
       <w:r>
         <w:rPr>
           <w:i/>
@@ -4808,7 +5579,11 @@
         <w:t>R</w:t>
       </w:r>
       <w:r>
-        <w:t xml:space="preserve">,  where </w:t>
+        <w:t>,  where</w:t>
+      </w:r>
+      <w:proofErr w:type="gramEnd"/>
+      <w:r>
+        <w:t xml:space="preserve"> </w:t>
       </w:r>
       <w:r>
         <w:rPr>
@@ -4829,8 +5604,13 @@
           <w:numId w:val="1"/>
         </w:numPr>
       </w:pPr>
-      <w:r>
-        <w:t xml:space="preserve">the radius </w:t>
+      <w:proofErr w:type="gramStart"/>
+      <w:r>
+        <w:t>the</w:t>
+      </w:r>
+      <w:proofErr w:type="gramEnd"/>
+      <w:r>
+        <w:t xml:space="preserve"> radius </w:t>
       </w:r>
       <w:r>
         <w:rPr>
@@ -4857,33 +5637,64 @@
           <w:numId w:val="1"/>
         </w:numPr>
       </w:pPr>
-      <w:r>
-        <w:t>the fish heading vectors should be tangent to the best-fit circle; specifically |cos(</w:t>
-      </w:r>
+      <w:proofErr w:type="gramStart"/>
+      <w:r>
+        <w:t>the</w:t>
+      </w:r>
+      <w:proofErr w:type="gramEnd"/>
+      <w:r>
+        <w:t xml:space="preserve"> fish heading vectors should be tangent to the best-fit circle; </w:t>
+      </w:r>
+      <w:proofErr w:type="gramStart"/>
+      <w:r>
+        <w:t>specifically</w:t>
+      </w:r>
+      <w:proofErr w:type="gramEnd"/>
+      <w:r>
+        <w:t xml:space="preserve"> |cos(</w:t>
+      </w:r>
+      <w:proofErr w:type="spellStart"/>
       <w:r>
         <w:rPr>
           <w:rFonts w:ascii="Calibri" w:hAnsi="Calibri" w:cs="Calibri"/>
         </w:rPr>
         <w:t>Θ</w:t>
       </w:r>
+      <w:proofErr w:type="gramStart"/>
       <w:r>
         <w:rPr>
           <w:vertAlign w:val="subscript"/>
         </w:rPr>
         <w:t>i</w:t>
       </w:r>
-      <w:r>
-        <w:t xml:space="preserve">)| &lt; </w:t>
-      </w:r>
+      <w:proofErr w:type="spellEnd"/>
+      <w:r>
+        <w:t>)|</w:t>
+      </w:r>
+      <w:proofErr w:type="gramEnd"/>
+      <w:r>
+        <w:t xml:space="preserve"> &lt; </w:t>
+      </w:r>
+      <w:proofErr w:type="spellStart"/>
       <w:r>
         <w:rPr>
           <w:rFonts w:ascii="Calibri" w:hAnsi="Calibri" w:cs="Calibri"/>
         </w:rPr>
         <w:t>cos_theta_tangent_threshold</w:t>
       </w:r>
-      <w:r>
-        <w:t xml:space="preserve">, for both fish i = 1,2, where </w:t>
-      </w:r>
+      <w:proofErr w:type="spellEnd"/>
+      <w:r>
+        <w:t xml:space="preserve">, for both fish </w:t>
+      </w:r>
+      <w:proofErr w:type="spellStart"/>
+      <w:r>
+        <w:t>i</w:t>
+      </w:r>
+      <w:proofErr w:type="spellEnd"/>
+      <w:r>
+        <w:t xml:space="preserve"> = 1,2, where </w:t>
+      </w:r>
+      <w:proofErr w:type="spellStart"/>
       <w:r>
         <w:rPr>
           <w:rFonts w:ascii="Calibri" w:hAnsi="Calibri" w:cs="Calibri"/>
@@ -4896,12 +5707,13 @@
         </w:rPr>
         <w:t>i</w:t>
       </w:r>
+      <w:proofErr w:type="spellEnd"/>
       <w:r>
         <w:t xml:space="preserve"> is the angle between the fish heading vector and the radial vector.</w:t>
       </w:r>
-      <w:bookmarkStart w:id="5" w:name="_Hlk136240183"/>
-    </w:p>
-    <w:bookmarkEnd w:id="5"/>
+      <w:bookmarkStart w:id="4" w:name="_Hlk136240183"/>
+    </w:p>
+    <w:bookmarkEnd w:id="4"/>
     <w:p>
       <w:pPr>
         <w:rPr>
@@ -4918,26 +5730,39 @@
       </w:r>
     </w:p>
     <w:p>
+      <w:proofErr w:type="spellStart"/>
       <w:r>
         <w:rPr>
           <w:rFonts w:asciiTheme="minorHAnsi" w:hAnsiTheme="minorHAnsi" w:cstheme="minorHAnsi"/>
         </w:rPr>
         <w:t>circle_windowsize</w:t>
       </w:r>
+      <w:proofErr w:type="spellEnd"/>
       <w:r>
         <w:t xml:space="preserve"> = 25 frames (1 s)</w:t>
       </w:r>
     </w:p>
     <w:p>
+      <w:proofErr w:type="spellStart"/>
       <w:r>
         <w:rPr>
           <w:rFonts w:ascii="Calibri" w:hAnsi="Calibri" w:cs="Calibri"/>
         </w:rPr>
         <w:t>motion_threshold</w:t>
       </w:r>
-      <w:r>
-        <w:t xml:space="preserve"> = 2 px (113 </w:t>
-      </w:r>
+      <w:proofErr w:type="spellEnd"/>
+      <w:r>
+        <w:t xml:space="preserve"> = 2 </w:t>
+      </w:r>
+      <w:proofErr w:type="spellStart"/>
+      <w:r>
+        <w:t>px</w:t>
+      </w:r>
+      <w:proofErr w:type="spellEnd"/>
+      <w:r>
+        <w:t xml:space="preserve"> (113 </w:t>
+      </w:r>
+      <w:proofErr w:type="spellStart"/>
       <w:r>
         <w:rPr>
           <w:rFonts w:ascii="Calibri" w:hAnsi="Calibri" w:cs="Calibri"/>
@@ -4945,38 +5770,48 @@
         <w:t>μ</w:t>
       </w:r>
       <w:r>
-        <w:t>m)</w:t>
-      </w:r>
-    </w:p>
-    <w:p>
+        <w:t>m</w:t>
+      </w:r>
+      <w:proofErr w:type="spellEnd"/>
+      <w:r>
+        <w:t>)</w:t>
+      </w:r>
+    </w:p>
+    <w:p>
+      <w:proofErr w:type="spellStart"/>
       <w:r>
         <w:rPr>
           <w:rFonts w:ascii="Calibri" w:hAnsi="Calibri" w:cs="Calibri"/>
         </w:rPr>
         <w:t>cos_theta_AP_threshold</w:t>
       </w:r>
+      <w:proofErr w:type="spellEnd"/>
       <w:r>
         <w:t xml:space="preserve"> = –0.7 (corresponding to 180 ± 45 degrees); was –0.9 (180 ± 26 degrees)</w:t>
       </w:r>
     </w:p>
     <w:p>
+      <w:proofErr w:type="spellStart"/>
       <w:r>
         <w:rPr>
           <w:rFonts w:ascii="Calibri" w:hAnsi="Calibri" w:cs="Calibri"/>
         </w:rPr>
         <w:t>circle_fit_threshold</w:t>
       </w:r>
+      <w:proofErr w:type="spellEnd"/>
       <w:r>
         <w:t xml:space="preserve"> = 0.25</w:t>
       </w:r>
     </w:p>
     <w:p>
+      <w:proofErr w:type="spellStart"/>
       <w:r>
         <w:rPr>
           <w:rFonts w:ascii="Calibri" w:hAnsi="Calibri" w:cs="Calibri"/>
         </w:rPr>
         <w:t>cos_theta_tangent_threshold</w:t>
       </w:r>
+      <w:proofErr w:type="spellEnd"/>
       <w:r>
         <w:rPr>
           <w:rFonts w:ascii="Calibri" w:hAnsi="Calibri" w:cs="Calibri"/>
@@ -4988,14 +5823,24 @@
       </w:r>
     </w:p>
     <w:p>
+      <w:proofErr w:type="spellStart"/>
       <w:r>
         <w:rPr>
           <w:rFonts w:ascii="Calibri" w:hAnsi="Calibri" w:cs="Calibri"/>
         </w:rPr>
         <w:t>circle_distance_threshold</w:t>
       </w:r>
-      <w:r>
-        <w:t xml:space="preserve"> = 240 px (13.6 mm)</w:t>
+      <w:proofErr w:type="spellEnd"/>
+      <w:r>
+        <w:t xml:space="preserve"> = 240 </w:t>
+      </w:r>
+      <w:proofErr w:type="spellStart"/>
+      <w:r>
+        <w:t>px</w:t>
+      </w:r>
+      <w:proofErr w:type="spellEnd"/>
+      <w:r>
+        <w:t xml:space="preserve"> (13.6 mm)</w:t>
       </w:r>
     </w:p>
     <w:p/>

</xml_diff>